<commit_message>
fix: listings list errors
</commit_message>
<xml_diff>
--- a/docs/Dokumentacja.docx
+++ b/docs/Dokumentacja.docx
@@ -6754,8 +6754,105 @@
           <w:szCs w:val="18"/>
         </w:rPr>
       </w:pPr>
-      <w:bookmarkStart w:id="20" w:name="_Toc232091805"/>
-      <w:bookmarkStart w:id="21" w:name="_Toc232609737"/>
+      <w:bookmarkStart w:id="20" w:name="_Toc232610176"/>
+      <w:r>
+        <w:rPr>
+          <w:rFonts w:ascii="Times New Roman" w:hAnsi="Times New Roman" w:cs="Times New Roman"/>
+          <w:sz w:val="18"/>
+          <w:szCs w:val="18"/>
+        </w:rPr>
+        <w:t xml:space="preserve">Listing </w:t>
+      </w:r>
+      <w:r>
+        <w:rPr>
+          <w:rFonts w:ascii="Times New Roman" w:hAnsi="Times New Roman" w:cs="Times New Roman"/>
+          <w:sz w:val="18"/>
+          <w:szCs w:val="18"/>
+        </w:rPr>
+        <w:fldChar w:fldCharType="begin"/>
+      </w:r>
+      <w:r>
+        <w:rPr>
+          <w:rFonts w:ascii="Times New Roman" w:hAnsi="Times New Roman" w:cs="Times New Roman"/>
+          <w:sz w:val="18"/>
+          <w:szCs w:val="18"/>
+        </w:rPr>
+        <w:instrText xml:space="preserve"> STYLEREF 1 \s </w:instrText>
+      </w:r>
+      <w:r>
+        <w:rPr>
+          <w:rFonts w:ascii="Times New Roman" w:hAnsi="Times New Roman" w:cs="Times New Roman"/>
+          <w:sz w:val="18"/>
+          <w:szCs w:val="18"/>
+        </w:rPr>
+        <w:fldChar w:fldCharType="separate"/>
+      </w:r>
+      <w:r>
+        <w:rPr>
+          <w:rFonts w:ascii="Times New Roman" w:hAnsi="Times New Roman" w:cs="Times New Roman"/>
+          <w:noProof/>
+          <w:sz w:val="18"/>
+          <w:szCs w:val="18"/>
+        </w:rPr>
+        <w:t>2</w:t>
+      </w:r>
+      <w:r>
+        <w:rPr>
+          <w:rFonts w:ascii="Times New Roman" w:hAnsi="Times New Roman" w:cs="Times New Roman"/>
+          <w:sz w:val="18"/>
+          <w:szCs w:val="18"/>
+        </w:rPr>
+        <w:fldChar w:fldCharType="end"/>
+      </w:r>
+      <w:r>
+        <w:rPr>
+          <w:rFonts w:ascii="Times New Roman" w:hAnsi="Times New Roman" w:cs="Times New Roman"/>
+          <w:sz w:val="18"/>
+          <w:szCs w:val="18"/>
+        </w:rPr>
+        <w:t>.</w:t>
+      </w:r>
+      <w:r>
+        <w:rPr>
+          <w:rFonts w:ascii="Times New Roman" w:hAnsi="Times New Roman" w:cs="Times New Roman"/>
+          <w:sz w:val="18"/>
+          <w:szCs w:val="18"/>
+        </w:rPr>
+        <w:fldChar w:fldCharType="begin"/>
+      </w:r>
+      <w:r>
+        <w:rPr>
+          <w:rFonts w:ascii="Times New Roman" w:hAnsi="Times New Roman" w:cs="Times New Roman"/>
+          <w:sz w:val="18"/>
+          <w:szCs w:val="18"/>
+        </w:rPr>
+        <w:instrText xml:space="preserve"> SEQ Listing \* ARABIC \s 1 </w:instrText>
+      </w:r>
+      <w:r>
+        <w:rPr>
+          <w:rFonts w:ascii="Times New Roman" w:hAnsi="Times New Roman" w:cs="Times New Roman"/>
+          <w:sz w:val="18"/>
+          <w:szCs w:val="18"/>
+        </w:rPr>
+        <w:fldChar w:fldCharType="separate"/>
+      </w:r>
+      <w:r>
+        <w:rPr>
+          <w:rFonts w:ascii="Times New Roman" w:hAnsi="Times New Roman" w:cs="Times New Roman"/>
+          <w:noProof/>
+          <w:sz w:val="18"/>
+          <w:szCs w:val="18"/>
+        </w:rPr>
+        <w:t>1</w:t>
+      </w:r>
+      <w:r>
+        <w:rPr>
+          <w:rFonts w:ascii="Times New Roman" w:hAnsi="Times New Roman" w:cs="Times New Roman"/>
+          <w:sz w:val="18"/>
+          <w:szCs w:val="18"/>
+        </w:rPr>
+        <w:fldChar w:fldCharType="end"/>
+      </w:r>
       <w:r>
         <w:rPr>
           <w:rFonts w:ascii="Times New Roman" w:hAnsi="Times New Roman" w:cs="Times New Roman"/>
@@ -6763,7 +6860,7 @@
           <w:sz w:val="18"/>
           <w:szCs w:val="18"/>
         </w:rPr>
-        <w:t xml:space="preserve">Listing </w:t>
+        <w:t xml:space="preserve"> </w:t>
       </w:r>
       <w:r>
         <w:rPr>
@@ -6771,113 +6868,8 @@
           <w:color w:val="000000" w:themeColor="text1"/>
           <w:sz w:val="18"/>
           <w:szCs w:val="18"/>
-          <w:lang w:val="en-US"/>
-        </w:rPr>
-        <w:fldChar w:fldCharType="begin"/>
-      </w:r>
-      <w:r>
-        <w:rPr>
-          <w:rFonts w:ascii="Times New Roman" w:hAnsi="Times New Roman" w:cs="Times New Roman"/>
-          <w:color w:val="000000" w:themeColor="text1"/>
-          <w:sz w:val="18"/>
-          <w:szCs w:val="18"/>
-        </w:rPr>
-        <w:instrText xml:space="preserve"> STYLEREF "1" </w:instrText>
-      </w:r>
-      <w:r>
-        <w:rPr>
-          <w:rFonts w:ascii="Times New Roman" w:hAnsi="Times New Roman" w:cs="Times New Roman"/>
-          <w:color w:val="000000" w:themeColor="text1"/>
-          <w:sz w:val="18"/>
-          <w:szCs w:val="18"/>
-          <w:lang w:val="en-US"/>
-        </w:rPr>
-        <w:fldChar w:fldCharType="separate"/>
-      </w:r>
-      <w:r>
-        <w:rPr>
-          <w:rFonts w:ascii="Times New Roman" w:hAnsi="Times New Roman" w:cs="Times New Roman"/>
-          <w:color w:val="000000" w:themeColor="text1"/>
-          <w:sz w:val="18"/>
-          <w:szCs w:val="18"/>
-        </w:rPr>
-        <w:t>Błąd: nie znaleziono źródła odwołania</w:t>
-      </w:r>
-      <w:r>
-        <w:rPr>
-          <w:rFonts w:ascii="Times New Roman" w:hAnsi="Times New Roman" w:cs="Times New Roman"/>
-          <w:color w:val="000000" w:themeColor="text1"/>
-          <w:sz w:val="18"/>
-          <w:szCs w:val="18"/>
-          <w:lang w:val="en-US"/>
-        </w:rPr>
-        <w:fldChar w:fldCharType="end"/>
-      </w:r>
-      <w:r>
-        <w:rPr>
-          <w:rFonts w:ascii="Times New Roman" w:hAnsi="Times New Roman" w:cs="Times New Roman"/>
-          <w:color w:val="000000" w:themeColor="text1"/>
-          <w:sz w:val="18"/>
-          <w:szCs w:val="18"/>
-        </w:rPr>
-        <w:t>.</w:t>
-      </w:r>
-      <w:r>
-        <w:rPr>
-          <w:rFonts w:ascii="Times New Roman" w:hAnsi="Times New Roman" w:cs="Times New Roman"/>
-          <w:color w:val="000000" w:themeColor="text1"/>
-          <w:sz w:val="18"/>
-          <w:szCs w:val="18"/>
-          <w:lang w:val="en-US"/>
-        </w:rPr>
-        <w:fldChar w:fldCharType="begin"/>
-      </w:r>
-      <w:r>
-        <w:rPr>
-          <w:rFonts w:ascii="Times New Roman" w:hAnsi="Times New Roman" w:cs="Times New Roman"/>
-          <w:color w:val="000000" w:themeColor="text1"/>
-          <w:sz w:val="18"/>
-          <w:szCs w:val="18"/>
-        </w:rPr>
-        <w:instrText xml:space="preserve"> SEQ Listing \* ARABIC </w:instrText>
-      </w:r>
-      <w:r>
-        <w:rPr>
-          <w:rFonts w:ascii="Times New Roman" w:hAnsi="Times New Roman" w:cs="Times New Roman"/>
-          <w:color w:val="000000" w:themeColor="text1"/>
-          <w:sz w:val="18"/>
-          <w:szCs w:val="18"/>
-          <w:lang w:val="en-US"/>
-        </w:rPr>
-        <w:fldChar w:fldCharType="separate"/>
-      </w:r>
-      <w:r>
-        <w:rPr>
-          <w:rFonts w:ascii="Times New Roman" w:hAnsi="Times New Roman" w:cs="Times New Roman"/>
-          <w:color w:val="000000" w:themeColor="text1"/>
-          <w:sz w:val="18"/>
-          <w:szCs w:val="18"/>
-        </w:rPr>
-        <w:t>1</w:t>
-      </w:r>
-      <w:r>
-        <w:rPr>
-          <w:rFonts w:ascii="Times New Roman" w:hAnsi="Times New Roman" w:cs="Times New Roman"/>
-          <w:color w:val="000000" w:themeColor="text1"/>
-          <w:sz w:val="18"/>
-          <w:szCs w:val="18"/>
-          <w:lang w:val="en-US"/>
-        </w:rPr>
-        <w:fldChar w:fldCharType="end"/>
-      </w:r>
-      <w:r>
-        <w:rPr>
-          <w:rFonts w:ascii="Times New Roman" w:hAnsi="Times New Roman" w:cs="Times New Roman"/>
-          <w:color w:val="000000" w:themeColor="text1"/>
-          <w:sz w:val="18"/>
-          <w:szCs w:val="18"/>
-        </w:rPr>
-        <w:t xml:space="preserve"> Kod </w:t>
+        </w:rPr>
+        <w:t xml:space="preserve">Kod </w:t>
       </w:r>
       <w:proofErr w:type="spellStart"/>
       <w:r>
@@ -6893,7 +6885,6 @@
         <w:t>parseValue</w:t>
       </w:r>
       <w:bookmarkEnd w:id="20"/>
-      <w:bookmarkEnd w:id="21"/>
       <w:proofErr w:type="spellEnd"/>
     </w:p>
     <w:p>
@@ -8751,7 +8742,7 @@
           <w:szCs w:val="18"/>
         </w:rPr>
       </w:pPr>
-      <w:bookmarkStart w:id="22" w:name="_Toc232609738"/>
+      <w:bookmarkStart w:id="21" w:name="_Toc232610177"/>
       <w:r>
         <w:rPr>
           <w:rFonts w:ascii="Times New Roman" w:hAnsi="Times New Roman" w:cs="Times New Roman"/>
@@ -8774,7 +8765,7 @@
           <w:sz w:val="18"/>
           <w:szCs w:val="18"/>
         </w:rPr>
-        <w:instrText xml:space="preserve"> STYLEREF "1" </w:instrText>
+        <w:instrText xml:space="preserve"> STYLEREF 1 \s </w:instrText>
       </w:r>
       <w:r>
         <w:rPr>
@@ -8787,10 +8778,11 @@
       <w:r>
         <w:rPr>
           <w:rFonts w:ascii="Times New Roman" w:hAnsi="Times New Roman" w:cs="Times New Roman"/>
+          <w:noProof/>
           <w:sz w:val="18"/>
           <w:szCs w:val="18"/>
         </w:rPr>
-        <w:t>Błąd: nie znaleziono źródła odwołania</w:t>
+        <w:t>2</w:t>
       </w:r>
       <w:r>
         <w:rPr>
@@ -8822,7 +8814,7 @@
           <w:sz w:val="18"/>
           <w:szCs w:val="18"/>
         </w:rPr>
-        <w:instrText xml:space="preserve"> SEQ Listing \* ARABIC </w:instrText>
+        <w:instrText xml:space="preserve"> SEQ Listing \* ARABIC \s 1 </w:instrText>
       </w:r>
       <w:r>
         <w:rPr>
@@ -8835,6 +8827,7 @@
       <w:r>
         <w:rPr>
           <w:rFonts w:ascii="Times New Roman" w:hAnsi="Times New Roman" w:cs="Times New Roman"/>
+          <w:noProof/>
           <w:sz w:val="18"/>
           <w:szCs w:val="18"/>
         </w:rPr>
@@ -8865,7 +8858,7 @@
         </w:rPr>
         <w:t>parseObject</w:t>
       </w:r>
-      <w:bookmarkEnd w:id="22"/>
+      <w:bookmarkEnd w:id="21"/>
       <w:proofErr w:type="spellEnd"/>
     </w:p>
     <w:p>
@@ -10748,7 +10741,7 @@
           <w:szCs w:val="18"/>
         </w:rPr>
       </w:pPr>
-      <w:bookmarkStart w:id="23" w:name="_Toc232609739"/>
+      <w:bookmarkStart w:id="22" w:name="_Toc232610178"/>
       <w:r>
         <w:rPr>
           <w:rFonts w:ascii="Times New Roman" w:hAnsi="Times New Roman" w:cs="Times New Roman"/>
@@ -10771,7 +10764,7 @@
           <w:sz w:val="18"/>
           <w:szCs w:val="18"/>
         </w:rPr>
-        <w:instrText xml:space="preserve"> STYLEREF "1" </w:instrText>
+        <w:instrText xml:space="preserve"> STYLEREF 1 \s </w:instrText>
       </w:r>
       <w:r>
         <w:rPr>
@@ -10784,10 +10777,11 @@
       <w:r>
         <w:rPr>
           <w:rFonts w:ascii="Times New Roman" w:hAnsi="Times New Roman" w:cs="Times New Roman"/>
+          <w:noProof/>
           <w:sz w:val="18"/>
           <w:szCs w:val="18"/>
         </w:rPr>
-        <w:t>Błąd: nie znaleziono źródła odwołania</w:t>
+        <w:t>2</w:t>
       </w:r>
       <w:r>
         <w:rPr>
@@ -10819,7 +10813,7 @@
           <w:sz w:val="18"/>
           <w:szCs w:val="18"/>
         </w:rPr>
-        <w:instrText xml:space="preserve"> SEQ Listing \* ARABIC </w:instrText>
+        <w:instrText xml:space="preserve"> SEQ Listing \* ARABIC \s 1 </w:instrText>
       </w:r>
       <w:r>
         <w:rPr>
@@ -10832,6 +10826,7 @@
       <w:r>
         <w:rPr>
           <w:rFonts w:ascii="Times New Roman" w:hAnsi="Times New Roman" w:cs="Times New Roman"/>
+          <w:noProof/>
           <w:sz w:val="18"/>
           <w:szCs w:val="18"/>
         </w:rPr>
@@ -10862,7 +10857,7 @@
         </w:rPr>
         <w:t>parseNumber</w:t>
       </w:r>
-      <w:bookmarkEnd w:id="23"/>
+      <w:bookmarkEnd w:id="22"/>
       <w:proofErr w:type="spellEnd"/>
     </w:p>
     <w:p>
@@ -10930,8 +10925,8 @@
           <w:rFonts w:ascii="Times New Roman" w:hAnsi="Times New Roman" w:cs="Times New Roman"/>
         </w:rPr>
       </w:pPr>
-      <w:bookmarkStart w:id="24" w:name="_Toc232096196"/>
-      <w:bookmarkStart w:id="25" w:name="_Toc232609734"/>
+      <w:bookmarkStart w:id="23" w:name="_Toc232096196"/>
+      <w:bookmarkStart w:id="24" w:name="_Toc232609734"/>
       <w:r>
         <w:rPr>
           <w:rFonts w:ascii="Times New Roman" w:hAnsi="Times New Roman" w:cs="Times New Roman"/>
@@ -10939,8 +10934,8 @@
         <w:lastRenderedPageBreak/>
         <w:t>Generator schematu</w:t>
       </w:r>
+      <w:bookmarkEnd w:id="23"/>
       <w:bookmarkEnd w:id="24"/>
-      <w:bookmarkEnd w:id="25"/>
     </w:p>
     <w:p>
       <w:pPr>
@@ -12364,7 +12359,7 @@
           <w:szCs w:val="18"/>
         </w:rPr>
       </w:pPr>
-      <w:bookmarkStart w:id="26" w:name="_Toc232609740"/>
+      <w:bookmarkStart w:id="25" w:name="_Toc232610179"/>
       <w:r>
         <w:rPr>
           <w:rFonts w:ascii="Times New Roman" w:hAnsi="Times New Roman" w:cs="Times New Roman"/>
@@ -12387,7 +12382,7 @@
           <w:sz w:val="18"/>
           <w:szCs w:val="18"/>
         </w:rPr>
-        <w:instrText xml:space="preserve"> STYLEREF "1" </w:instrText>
+        <w:instrText xml:space="preserve"> STYLEREF 1 \s </w:instrText>
       </w:r>
       <w:r>
         <w:rPr>
@@ -12400,10 +12395,11 @@
       <w:r>
         <w:rPr>
           <w:rFonts w:ascii="Times New Roman" w:hAnsi="Times New Roman" w:cs="Times New Roman"/>
+          <w:noProof/>
           <w:sz w:val="18"/>
           <w:szCs w:val="18"/>
         </w:rPr>
-        <w:t>Błąd: nie znaleziono źródła odwołania</w:t>
+        <w:t>2</w:t>
       </w:r>
       <w:r>
         <w:rPr>
@@ -12435,7 +12431,7 @@
           <w:sz w:val="18"/>
           <w:szCs w:val="18"/>
         </w:rPr>
-        <w:instrText xml:space="preserve"> SEQ Listing \* ARABIC </w:instrText>
+        <w:instrText xml:space="preserve"> SEQ Listing \* ARABIC \s 1 </w:instrText>
       </w:r>
       <w:r>
         <w:rPr>
@@ -12448,6 +12444,7 @@
       <w:r>
         <w:rPr>
           <w:rFonts w:ascii="Times New Roman" w:hAnsi="Times New Roman" w:cs="Times New Roman"/>
+          <w:noProof/>
           <w:sz w:val="18"/>
           <w:szCs w:val="18"/>
         </w:rPr>
@@ -12478,7 +12475,7 @@
         </w:rPr>
         <w:t>generate</w:t>
       </w:r>
-      <w:bookmarkEnd w:id="26"/>
+      <w:bookmarkEnd w:id="25"/>
       <w:proofErr w:type="spellEnd"/>
     </w:p>
     <w:p>
@@ -14338,7 +14335,7 @@
           <w:szCs w:val="12"/>
         </w:rPr>
       </w:pPr>
-      <w:bookmarkStart w:id="27" w:name="_Toc232609741"/>
+      <w:bookmarkStart w:id="26" w:name="_Toc232610180"/>
       <w:r>
         <w:rPr>
           <w:rFonts w:ascii="Times New Roman" w:hAnsi="Times New Roman" w:cs="Times New Roman"/>
@@ -14361,7 +14358,7 @@
           <w:sz w:val="18"/>
           <w:szCs w:val="18"/>
         </w:rPr>
-        <w:instrText xml:space="preserve"> STYLEREF "1" </w:instrText>
+        <w:instrText xml:space="preserve"> STYLEREF 1 \s </w:instrText>
       </w:r>
       <w:r>
         <w:rPr>
@@ -14374,10 +14371,11 @@
       <w:r>
         <w:rPr>
           <w:rFonts w:ascii="Times New Roman" w:hAnsi="Times New Roman" w:cs="Times New Roman"/>
+          <w:noProof/>
           <w:sz w:val="18"/>
           <w:szCs w:val="18"/>
         </w:rPr>
-        <w:t>Błąd: nie znaleziono źródła odwołania</w:t>
+        <w:t>2</w:t>
       </w:r>
       <w:r>
         <w:rPr>
@@ -14409,7 +14407,7 @@
           <w:sz w:val="18"/>
           <w:szCs w:val="18"/>
         </w:rPr>
-        <w:instrText xml:space="preserve"> SEQ Listing \* ARABIC </w:instrText>
+        <w:instrText xml:space="preserve"> SEQ Listing \* ARABIC \s 1 </w:instrText>
       </w:r>
       <w:r>
         <w:rPr>
@@ -14422,6 +14420,7 @@
       <w:r>
         <w:rPr>
           <w:rFonts w:ascii="Times New Roman" w:hAnsi="Times New Roman" w:cs="Times New Roman"/>
+          <w:noProof/>
           <w:sz w:val="18"/>
           <w:szCs w:val="18"/>
         </w:rPr>
@@ -14452,7 +14451,7 @@
         </w:rPr>
         <w:t>setType</w:t>
       </w:r>
-      <w:bookmarkEnd w:id="27"/>
+      <w:bookmarkEnd w:id="26"/>
       <w:proofErr w:type="spellEnd"/>
     </w:p>
     <w:p>
@@ -15770,7 +15769,7 @@
           <w:szCs w:val="18"/>
         </w:rPr>
       </w:pPr>
-      <w:bookmarkStart w:id="28" w:name="_Toc232609742"/>
+      <w:bookmarkStart w:id="27" w:name="_Toc232610181"/>
       <w:r>
         <w:rPr>
           <w:rFonts w:ascii="Times New Roman" w:hAnsi="Times New Roman" w:cs="Times New Roman"/>
@@ -15793,7 +15792,7 @@
           <w:sz w:val="18"/>
           <w:szCs w:val="18"/>
         </w:rPr>
-        <w:instrText xml:space="preserve"> STYLEREF "1" </w:instrText>
+        <w:instrText xml:space="preserve"> STYLEREF 1 \s </w:instrText>
       </w:r>
       <w:r>
         <w:rPr>
@@ -15806,10 +15805,11 @@
       <w:r>
         <w:rPr>
           <w:rFonts w:ascii="Times New Roman" w:hAnsi="Times New Roman" w:cs="Times New Roman"/>
+          <w:noProof/>
           <w:sz w:val="18"/>
           <w:szCs w:val="18"/>
         </w:rPr>
-        <w:t>Błąd: nie znaleziono źródła odwołania</w:t>
+        <w:t>2</w:t>
       </w:r>
       <w:r>
         <w:rPr>
@@ -15841,7 +15841,7 @@
           <w:sz w:val="18"/>
           <w:szCs w:val="18"/>
         </w:rPr>
-        <w:instrText xml:space="preserve"> SEQ Listing \* ARABIC </w:instrText>
+        <w:instrText xml:space="preserve"> SEQ Listing \* ARABIC \s 1 </w:instrText>
       </w:r>
       <w:r>
         <w:rPr>
@@ -15854,6 +15854,7 @@
       <w:r>
         <w:rPr>
           <w:rFonts w:ascii="Times New Roman" w:hAnsi="Times New Roman" w:cs="Times New Roman"/>
+          <w:noProof/>
           <w:sz w:val="18"/>
           <w:szCs w:val="18"/>
         </w:rPr>
@@ -15884,7 +15885,7 @@
         </w:rPr>
         <w:t>setTypeObject</w:t>
       </w:r>
-      <w:bookmarkEnd w:id="28"/>
+      <w:bookmarkEnd w:id="27"/>
       <w:proofErr w:type="spellEnd"/>
     </w:p>
     <w:p>
@@ -16588,7 +16589,7 @@
           <w:szCs w:val="18"/>
         </w:rPr>
       </w:pPr>
-      <w:bookmarkStart w:id="29" w:name="_Toc232609743"/>
+      <w:bookmarkStart w:id="28" w:name="_Toc232610182"/>
       <w:r>
         <w:rPr>
           <w:rFonts w:ascii="Times New Roman" w:hAnsi="Times New Roman" w:cs="Times New Roman"/>
@@ -16611,7 +16612,7 @@
           <w:sz w:val="18"/>
           <w:szCs w:val="18"/>
         </w:rPr>
-        <w:instrText xml:space="preserve"> STYLEREF "1" </w:instrText>
+        <w:instrText xml:space="preserve"> STYLEREF 1 \s </w:instrText>
       </w:r>
       <w:r>
         <w:rPr>
@@ -16624,10 +16625,11 @@
       <w:r>
         <w:rPr>
           <w:rFonts w:ascii="Times New Roman" w:hAnsi="Times New Roman" w:cs="Times New Roman"/>
+          <w:noProof/>
           <w:sz w:val="18"/>
           <w:szCs w:val="18"/>
         </w:rPr>
-        <w:t>Błąd: nie znaleziono źródła odwołania</w:t>
+        <w:t>2</w:t>
       </w:r>
       <w:r>
         <w:rPr>
@@ -16659,7 +16661,7 @@
           <w:sz w:val="18"/>
           <w:szCs w:val="18"/>
         </w:rPr>
-        <w:instrText xml:space="preserve"> SEQ Listing \* ARABIC </w:instrText>
+        <w:instrText xml:space="preserve"> SEQ Listing \* ARABIC \s 1 </w:instrText>
       </w:r>
       <w:r>
         <w:rPr>
@@ -16672,6 +16674,7 @@
       <w:r>
         <w:rPr>
           <w:rFonts w:ascii="Times New Roman" w:hAnsi="Times New Roman" w:cs="Times New Roman"/>
+          <w:noProof/>
           <w:sz w:val="18"/>
           <w:szCs w:val="18"/>
         </w:rPr>
@@ -16702,7 +16705,7 @@
         </w:rPr>
         <w:t>validate</w:t>
       </w:r>
-      <w:bookmarkEnd w:id="29"/>
+      <w:bookmarkEnd w:id="28"/>
       <w:proofErr w:type="spellEnd"/>
     </w:p>
     <w:p>
@@ -17679,7 +17682,7 @@
           <w:szCs w:val="18"/>
         </w:rPr>
       </w:pPr>
-      <w:bookmarkStart w:id="30" w:name="_Toc232609744"/>
+      <w:bookmarkStart w:id="29" w:name="_Toc232610183"/>
       <w:r>
         <w:rPr>
           <w:rFonts w:ascii="Times New Roman" w:hAnsi="Times New Roman" w:cs="Times New Roman"/>
@@ -17702,7 +17705,7 @@
           <w:sz w:val="18"/>
           <w:szCs w:val="18"/>
         </w:rPr>
-        <w:instrText xml:space="preserve"> STYLEREF "1" </w:instrText>
+        <w:instrText xml:space="preserve"> STYLEREF 1 \s </w:instrText>
       </w:r>
       <w:r>
         <w:rPr>
@@ -17715,10 +17718,11 @@
       <w:r>
         <w:rPr>
           <w:rFonts w:ascii="Times New Roman" w:hAnsi="Times New Roman" w:cs="Times New Roman"/>
+          <w:noProof/>
           <w:sz w:val="18"/>
           <w:szCs w:val="18"/>
         </w:rPr>
-        <w:t>Błąd: nie znaleziono źródła odwołania</w:t>
+        <w:t>2</w:t>
       </w:r>
       <w:r>
         <w:rPr>
@@ -17750,7 +17754,7 @@
           <w:sz w:val="18"/>
           <w:szCs w:val="18"/>
         </w:rPr>
-        <w:instrText xml:space="preserve"> SEQ Listing \* ARABIC </w:instrText>
+        <w:instrText xml:space="preserve"> SEQ Listing \* ARABIC \s 1 </w:instrText>
       </w:r>
       <w:r>
         <w:rPr>
@@ -17763,6 +17767,7 @@
       <w:r>
         <w:rPr>
           <w:rFonts w:ascii="Times New Roman" w:hAnsi="Times New Roman" w:cs="Times New Roman"/>
+          <w:noProof/>
           <w:sz w:val="18"/>
           <w:szCs w:val="18"/>
         </w:rPr>
@@ -17793,7 +17798,7 @@
         </w:rPr>
         <w:t>validateNode</w:t>
       </w:r>
-      <w:bookmarkEnd w:id="30"/>
+      <w:bookmarkEnd w:id="29"/>
       <w:proofErr w:type="spellEnd"/>
     </w:p>
     <w:p>
@@ -19333,7 +19338,7 @@
           <w:szCs w:val="18"/>
         </w:rPr>
       </w:pPr>
-      <w:bookmarkStart w:id="31" w:name="_Toc232609745"/>
+      <w:bookmarkStart w:id="30" w:name="_Toc232610184"/>
       <w:r>
         <w:rPr>
           <w:rFonts w:ascii="Times New Roman" w:hAnsi="Times New Roman" w:cs="Times New Roman"/>
@@ -19356,7 +19361,7 @@
           <w:sz w:val="18"/>
           <w:szCs w:val="18"/>
         </w:rPr>
-        <w:instrText xml:space="preserve"> STYLEREF "1" </w:instrText>
+        <w:instrText xml:space="preserve"> STYLEREF 1 \s </w:instrText>
       </w:r>
       <w:r>
         <w:rPr>
@@ -19369,10 +19374,11 @@
       <w:r>
         <w:rPr>
           <w:rFonts w:ascii="Times New Roman" w:hAnsi="Times New Roman" w:cs="Times New Roman"/>
+          <w:noProof/>
           <w:sz w:val="18"/>
           <w:szCs w:val="18"/>
         </w:rPr>
-        <w:t>Błąd: nie znaleziono źródła odwołania</w:t>
+        <w:t>2</w:t>
       </w:r>
       <w:r>
         <w:rPr>
@@ -19404,7 +19410,7 @@
           <w:sz w:val="18"/>
           <w:szCs w:val="18"/>
         </w:rPr>
-        <w:instrText xml:space="preserve"> SEQ Listing \* ARABIC </w:instrText>
+        <w:instrText xml:space="preserve"> SEQ Listing \* ARABIC \s 1 </w:instrText>
       </w:r>
       <w:r>
         <w:rPr>
@@ -19417,6 +19423,7 @@
       <w:r>
         <w:rPr>
           <w:rFonts w:ascii="Times New Roman" w:hAnsi="Times New Roman" w:cs="Times New Roman"/>
+          <w:noProof/>
           <w:sz w:val="18"/>
           <w:szCs w:val="18"/>
         </w:rPr>
@@ -19447,7 +19454,7 @@
         </w:rPr>
         <w:t>validateNode</w:t>
       </w:r>
-      <w:bookmarkEnd w:id="31"/>
+      <w:bookmarkEnd w:id="30"/>
       <w:proofErr w:type="spellEnd"/>
     </w:p>
     <w:p>
@@ -21215,7 +21222,7 @@
           <w:rFonts w:ascii="Times New Roman" w:hAnsi="Times New Roman"/>
         </w:rPr>
       </w:pPr>
-      <w:bookmarkStart w:id="32" w:name="_Toc232609735"/>
+      <w:bookmarkStart w:id="31" w:name="_Toc232609735"/>
       <w:r>
         <w:rPr>
           <w:rFonts w:ascii="Times New Roman" w:hAnsi="Times New Roman"/>
@@ -21223,7 +21230,7 @@
         <w:lastRenderedPageBreak/>
         <w:t>Instrukcja użytkowania</w:t>
       </w:r>
-      <w:bookmarkEnd w:id="32"/>
+      <w:bookmarkEnd w:id="31"/>
     </w:p>
     <w:p>
       <w:pPr>
@@ -21295,7 +21302,7 @@
           <w:szCs w:val="18"/>
         </w:rPr>
       </w:pPr>
-      <w:bookmarkStart w:id="33" w:name="_Toc232609748"/>
+      <w:bookmarkStart w:id="32" w:name="_Toc232609748"/>
       <w:r>
         <w:rPr>
           <w:rFonts w:ascii="Times New Roman" w:hAnsi="Times New Roman" w:cs="Times New Roman"/>
@@ -21426,7 +21433,7 @@
         </w:rPr>
         <w:t>wne</w:t>
       </w:r>
-      <w:bookmarkEnd w:id="33"/>
+      <w:bookmarkEnd w:id="32"/>
     </w:p>
     <w:p>
       <w:pPr>
@@ -21521,7 +21528,7 @@
           <w:szCs w:val="18"/>
         </w:rPr>
       </w:pPr>
-      <w:bookmarkStart w:id="34" w:name="_Toc232609749"/>
+      <w:bookmarkStart w:id="33" w:name="_Toc232609749"/>
       <w:r>
         <w:rPr>
           <w:rFonts w:ascii="Times New Roman" w:hAnsi="Times New Roman" w:cs="Times New Roman"/>
@@ -21644,7 +21651,7 @@
         </w:rPr>
         <w:t xml:space="preserve"> po załadowaniu JSON i wygenerowaniu schematu</w:t>
       </w:r>
-      <w:bookmarkEnd w:id="34"/>
+      <w:bookmarkEnd w:id="33"/>
     </w:p>
     <w:p>
       <w:pPr>
@@ -21725,7 +21732,7 @@
           <w:szCs w:val="18"/>
         </w:rPr>
       </w:pPr>
-      <w:bookmarkStart w:id="35" w:name="_Toc232609750"/>
+      <w:bookmarkStart w:id="34" w:name="_Toc232609750"/>
       <w:r>
         <w:rPr>
           <w:rFonts w:ascii="Times New Roman" w:hAnsi="Times New Roman" w:cs="Times New Roman"/>
@@ -21832,7 +21839,7 @@
         </w:rPr>
         <w:t xml:space="preserve"> Okno edycji</w:t>
       </w:r>
-      <w:bookmarkEnd w:id="35"/>
+      <w:bookmarkEnd w:id="34"/>
     </w:p>
     <w:p>
       <w:pPr>
@@ -21939,7 +21946,7 @@
           <w:szCs w:val="18"/>
         </w:rPr>
       </w:pPr>
-      <w:bookmarkStart w:id="36" w:name="_Toc232609751"/>
+      <w:bookmarkStart w:id="35" w:name="_Toc232609751"/>
       <w:r>
         <w:rPr>
           <w:rFonts w:ascii="Times New Roman" w:hAnsi="Times New Roman" w:cs="Times New Roman"/>
@@ -22046,7 +22053,7 @@
         </w:rPr>
         <w:t xml:space="preserve"> Okno po walidacji</w:t>
       </w:r>
-      <w:bookmarkEnd w:id="36"/>
+      <w:bookmarkEnd w:id="35"/>
     </w:p>
     <w:p>
       <w:pPr>
@@ -22176,7 +22183,7 @@
           <w:szCs w:val="18"/>
         </w:rPr>
       </w:pPr>
-      <w:bookmarkStart w:id="37" w:name="_Toc232609752"/>
+      <w:bookmarkStart w:id="36" w:name="_Toc232609752"/>
       <w:r>
         <w:rPr>
           <w:rFonts w:ascii="Times New Roman" w:hAnsi="Times New Roman" w:cs="Times New Roman"/>
@@ -22283,7 +22290,7 @@
         </w:rPr>
         <w:t xml:space="preserve"> Okno zarządzania schematami</w:t>
       </w:r>
-      <w:bookmarkEnd w:id="37"/>
+      <w:bookmarkEnd w:id="36"/>
     </w:p>
     <w:p>
       <w:pPr>
@@ -22332,7 +22339,7 @@
           <w:numId w:val="1"/>
         </w:numPr>
       </w:pPr>
-      <w:bookmarkStart w:id="38" w:name="_Toc232609736"/>
+      <w:bookmarkStart w:id="37" w:name="_Toc232609736"/>
       <w:r>
         <w:rPr>
           <w:rFonts w:ascii="Times New Roman" w:hAnsi="Times New Roman"/>
@@ -22340,7 +22347,7 @@
         <w:lastRenderedPageBreak/>
         <w:t>Testy</w:t>
       </w:r>
-      <w:bookmarkEnd w:id="38"/>
+      <w:bookmarkEnd w:id="37"/>
     </w:p>
     <w:p>
       <w:pPr>
@@ -22719,14 +22726,14 @@
         </w:rPr>
         <w:fldChar w:fldCharType="separate"/>
       </w:r>
-      <w:hyperlink w:anchor="_Toc232609737" w:history="1">
+      <w:hyperlink w:anchor="_Toc232610176" w:history="1">
         <w:r>
           <w:rPr>
             <w:rStyle w:val="Hipercze"/>
             <w:rFonts w:ascii="Times New Roman" w:hAnsi="Times New Roman" w:cs="Times New Roman"/>
             <w:noProof/>
           </w:rPr>
-          <w:t xml:space="preserve">Listing Błąd: nie znaleziono źródła odwołania.1 Kod </w:t>
+          <w:t xml:space="preserve">Listing 2.1 Kod </w:t>
         </w:r>
         <w:r>
           <w:rPr>
@@ -22755,7 +22762,7 @@
           <w:rPr>
             <w:noProof/>
           </w:rPr>
-          <w:instrText xml:space="preserve"> PAGEREF _Toc232609737 \h </w:instrText>
+          <w:instrText xml:space="preserve"> PAGEREF _Toc232610176 \h </w:instrText>
         </w:r>
         <w:r>
           <w:rPr>
@@ -22794,14 +22801,14 @@
           <w:lang w:eastAsia="pl-PL"/>
         </w:rPr>
       </w:pPr>
-      <w:hyperlink w:anchor="_Toc232609738" w:history="1">
+      <w:hyperlink w:anchor="_Toc232610177" w:history="1">
         <w:r>
           <w:rPr>
             <w:rStyle w:val="Hipercze"/>
             <w:rFonts w:ascii="Times New Roman" w:hAnsi="Times New Roman" w:cs="Times New Roman"/>
             <w:noProof/>
           </w:rPr>
-          <w:t>Listing Błąd: nie znaleziono źródła odwołania.2 Kod parseObject</w:t>
+          <w:t>Listing 2.2 Kod parseObject</w:t>
         </w:r>
         <w:r>
           <w:rPr>
@@ -22819,7 +22826,7 @@
           <w:rPr>
             <w:noProof/>
           </w:rPr>
-          <w:instrText xml:space="preserve"> PAGEREF _Toc232609738 \h </w:instrText>
+          <w:instrText xml:space="preserve"> PAGEREF _Toc232610177 \h </w:instrText>
         </w:r>
         <w:r>
           <w:rPr>
@@ -22858,14 +22865,14 @@
           <w:lang w:eastAsia="pl-PL"/>
         </w:rPr>
       </w:pPr>
-      <w:hyperlink w:anchor="_Toc232609739" w:history="1">
+      <w:hyperlink w:anchor="_Toc232610178" w:history="1">
         <w:r>
           <w:rPr>
             <w:rStyle w:val="Hipercze"/>
             <w:rFonts w:ascii="Times New Roman" w:hAnsi="Times New Roman" w:cs="Times New Roman"/>
             <w:noProof/>
           </w:rPr>
-          <w:t>Listing Błąd: nie znaleziono źródła odwołania.3 Kod parseNumber</w:t>
+          <w:t>Listing 2.3 Kod parseNumber</w:t>
         </w:r>
         <w:r>
           <w:rPr>
@@ -22883,7 +22890,7 @@
           <w:rPr>
             <w:noProof/>
           </w:rPr>
-          <w:instrText xml:space="preserve"> PAGEREF _Toc232609739 \h </w:instrText>
+          <w:instrText xml:space="preserve"> PAGEREF _Toc232610178 \h </w:instrText>
         </w:r>
         <w:r>
           <w:rPr>
@@ -22922,14 +22929,14 @@
           <w:lang w:eastAsia="pl-PL"/>
         </w:rPr>
       </w:pPr>
-      <w:hyperlink w:anchor="_Toc232609740" w:history="1">
+      <w:hyperlink w:anchor="_Toc232610179" w:history="1">
         <w:r>
           <w:rPr>
             <w:rStyle w:val="Hipercze"/>
             <w:rFonts w:ascii="Times New Roman" w:hAnsi="Times New Roman" w:cs="Times New Roman"/>
             <w:noProof/>
           </w:rPr>
-          <w:t>Listing Błąd: nie znaleziono źródła odwołania.4 Kod generate</w:t>
+          <w:t>Listing 2.4 Kod generate</w:t>
         </w:r>
         <w:r>
           <w:rPr>
@@ -22947,7 +22954,7 @@
           <w:rPr>
             <w:noProof/>
           </w:rPr>
-          <w:instrText xml:space="preserve"> PAGEREF _Toc232609740 \h </w:instrText>
+          <w:instrText xml:space="preserve"> PAGEREF _Toc232610179 \h </w:instrText>
         </w:r>
         <w:r>
           <w:rPr>
@@ -22986,14 +22993,14 @@
           <w:lang w:eastAsia="pl-PL"/>
         </w:rPr>
       </w:pPr>
-      <w:hyperlink w:anchor="_Toc232609741" w:history="1">
+      <w:hyperlink w:anchor="_Toc232610180" w:history="1">
         <w:r>
           <w:rPr>
             <w:rStyle w:val="Hipercze"/>
             <w:rFonts w:ascii="Times New Roman" w:hAnsi="Times New Roman" w:cs="Times New Roman"/>
             <w:noProof/>
           </w:rPr>
-          <w:t>Listing Błąd: nie znaleziono źródła odwołania.5 Kod setType</w:t>
+          <w:t>Listing 2.5 Kod setType</w:t>
         </w:r>
         <w:r>
           <w:rPr>
@@ -23011,7 +23018,7 @@
           <w:rPr>
             <w:noProof/>
           </w:rPr>
-          <w:instrText xml:space="preserve"> PAGEREF _Toc232609741 \h </w:instrText>
+          <w:instrText xml:space="preserve"> PAGEREF _Toc232610180 \h </w:instrText>
         </w:r>
         <w:r>
           <w:rPr>
@@ -23050,14 +23057,14 @@
           <w:lang w:eastAsia="pl-PL"/>
         </w:rPr>
       </w:pPr>
-      <w:hyperlink w:anchor="_Toc232609742" w:history="1">
+      <w:hyperlink w:anchor="_Toc232610181" w:history="1">
         <w:r>
           <w:rPr>
             <w:rStyle w:val="Hipercze"/>
             <w:rFonts w:ascii="Times New Roman" w:hAnsi="Times New Roman" w:cs="Times New Roman"/>
             <w:noProof/>
           </w:rPr>
-          <w:t>Listing Błąd: nie znaleziono źródła odwołania.6 Kod setTypeObject</w:t>
+          <w:t>Listing 2.6 Kod setTypeObject</w:t>
         </w:r>
         <w:r>
           <w:rPr>
@@ -23075,7 +23082,7 @@
           <w:rPr>
             <w:noProof/>
           </w:rPr>
-          <w:instrText xml:space="preserve"> PAGEREF _Toc232609742 \h </w:instrText>
+          <w:instrText xml:space="preserve"> PAGEREF _Toc232610181 \h </w:instrText>
         </w:r>
         <w:r>
           <w:rPr>
@@ -23114,14 +23121,14 @@
           <w:lang w:eastAsia="pl-PL"/>
         </w:rPr>
       </w:pPr>
-      <w:hyperlink w:anchor="_Toc232609743" w:history="1">
+      <w:hyperlink w:anchor="_Toc232610182" w:history="1">
         <w:r>
           <w:rPr>
             <w:rStyle w:val="Hipercze"/>
             <w:rFonts w:ascii="Times New Roman" w:hAnsi="Times New Roman" w:cs="Times New Roman"/>
             <w:noProof/>
           </w:rPr>
-          <w:t>Listing Błąd: nie znaleziono źródła odwołania.7 Kod validate</w:t>
+          <w:t>Listing 2.7 Kod validate</w:t>
         </w:r>
         <w:r>
           <w:rPr>
@@ -23139,7 +23146,7 @@
           <w:rPr>
             <w:noProof/>
           </w:rPr>
-          <w:instrText xml:space="preserve"> PAGEREF _Toc232609743 \h </w:instrText>
+          <w:instrText xml:space="preserve"> PAGEREF _Toc232610182 \h </w:instrText>
         </w:r>
         <w:r>
           <w:rPr>
@@ -23178,14 +23185,14 @@
           <w:lang w:eastAsia="pl-PL"/>
         </w:rPr>
       </w:pPr>
-      <w:hyperlink w:anchor="_Toc232609744" w:history="1">
+      <w:hyperlink w:anchor="_Toc232610183" w:history="1">
         <w:r>
           <w:rPr>
             <w:rStyle w:val="Hipercze"/>
             <w:rFonts w:ascii="Times New Roman" w:hAnsi="Times New Roman" w:cs="Times New Roman"/>
             <w:noProof/>
           </w:rPr>
-          <w:t>Listing Błąd: nie znaleziono źródła odwołania.8 Fragment I kodu metody validateNode</w:t>
+          <w:t>Listing 2.8 Fragment I kodu metody validateNode</w:t>
         </w:r>
         <w:r>
           <w:rPr>
@@ -23203,7 +23210,7 @@
           <w:rPr>
             <w:noProof/>
           </w:rPr>
-          <w:instrText xml:space="preserve"> PAGEREF _Toc232609744 \h </w:instrText>
+          <w:instrText xml:space="preserve"> PAGEREF _Toc232610183 \h </w:instrText>
         </w:r>
         <w:r>
           <w:rPr>
@@ -23242,14 +23249,14 @@
           <w:lang w:eastAsia="pl-PL"/>
         </w:rPr>
       </w:pPr>
-      <w:hyperlink w:anchor="_Toc232609745" w:history="1">
+      <w:hyperlink w:anchor="_Toc232610184" w:history="1">
         <w:r>
           <w:rPr>
             <w:rStyle w:val="Hipercze"/>
             <w:rFonts w:ascii="Times New Roman" w:hAnsi="Times New Roman" w:cs="Times New Roman"/>
             <w:noProof/>
           </w:rPr>
-          <w:t>Listing Błąd: nie znaleziono źródła odwołania.9 Fragment II kodu metody validateNode</w:t>
+          <w:t>Listing 2.9 Fragment II kodu metody validateNode</w:t>
         </w:r>
         <w:r>
           <w:rPr>
@@ -23267,7 +23274,7 @@
           <w:rPr>
             <w:noProof/>
           </w:rPr>
-          <w:instrText xml:space="preserve"> PAGEREF _Toc232609745 \h </w:instrText>
+          <w:instrText xml:space="preserve"> PAGEREF _Toc232610184 \h </w:instrText>
         </w:r>
         <w:r>
           <w:rPr>

</xml_diff>

<commit_message>
feat: add page numeration
</commit_message>
<xml_diff>
--- a/docs/Dokumentacja.docx
+++ b/docs/Dokumentacja.docx
@@ -60,7 +60,7 @@
                     </pic:cNvPicPr>
                   </pic:nvPicPr>
                   <pic:blipFill>
-                    <a:blip r:embed="rId6"/>
+                    <a:blip r:embed="rId8"/>
                     <a:stretch>
                       <a:fillRect/>
                     </a:stretch>
@@ -3401,7 +3401,7 @@
                     </pic:cNvPicPr>
                   </pic:nvPicPr>
                   <pic:blipFill>
-                    <a:blip r:embed="rId7"/>
+                    <a:blip r:embed="rId9"/>
                     <a:stretch>
                       <a:fillRect/>
                     </a:stretch>
@@ -3645,7 +3645,7 @@
                     </pic:cNvPicPr>
                   </pic:nvPicPr>
                   <pic:blipFill>
-                    <a:blip r:embed="rId8"/>
+                    <a:blip r:embed="rId10"/>
                     <a:stretch>
                       <a:fillRect/>
                     </a:stretch>
@@ -6860,16 +6860,7 @@
           <w:sz w:val="18"/>
           <w:szCs w:val="18"/>
         </w:rPr>
-        <w:t xml:space="preserve"> </w:t>
-      </w:r>
-      <w:r>
-        <w:rPr>
-          <w:rFonts w:ascii="Times New Roman" w:hAnsi="Times New Roman" w:cs="Times New Roman"/>
-          <w:color w:val="000000" w:themeColor="text1"/>
-          <w:sz w:val="18"/>
-          <w:szCs w:val="18"/>
-        </w:rPr>
-        <w:t xml:space="preserve">Kod </w:t>
+        <w:t xml:space="preserve"> Kod </w:t>
       </w:r>
       <w:proofErr w:type="spellStart"/>
       <w:r>
@@ -21271,7 +21262,7 @@
                     <pic:cNvPicPr/>
                   </pic:nvPicPr>
                   <pic:blipFill>
-                    <a:blip r:embed="rId9"/>
+                    <a:blip r:embed="rId11"/>
                     <a:stretch>
                       <a:fillRect/>
                     </a:stretch>
@@ -21494,424 +21485,6 @@
                 <pic:pic xmlns:pic="http://schemas.openxmlformats.org/drawingml/2006/picture">
                   <pic:nvPicPr>
                     <pic:cNvPr id="468315952" name=""/>
-                    <pic:cNvPicPr/>
-                  </pic:nvPicPr>
-                  <pic:blipFill>
-                    <a:blip r:embed="rId10"/>
-                    <a:stretch>
-                      <a:fillRect/>
-                    </a:stretch>
-                  </pic:blipFill>
-                  <pic:spPr>
-                    <a:xfrm>
-                      <a:off x="0" y="0"/>
-                      <a:ext cx="5760720" cy="3354070"/>
-                    </a:xfrm>
-                    <a:prstGeom prst="rect">
-                      <a:avLst/>
-                    </a:prstGeom>
-                  </pic:spPr>
-                </pic:pic>
-              </a:graphicData>
-            </a:graphic>
-          </wp:inline>
-        </w:drawing>
-      </w:r>
-    </w:p>
-    <w:p>
-      <w:pPr>
-        <w:pStyle w:val="Legenda"/>
-        <w:jc w:val="center"/>
-        <w:rPr>
-          <w:rFonts w:ascii="Times New Roman" w:hAnsi="Times New Roman" w:cs="Times New Roman"/>
-          <w:sz w:val="18"/>
-          <w:szCs w:val="18"/>
-        </w:rPr>
-      </w:pPr>
-      <w:bookmarkStart w:id="33" w:name="_Toc232609749"/>
-      <w:r>
-        <w:rPr>
-          <w:rFonts w:ascii="Times New Roman" w:hAnsi="Times New Roman" w:cs="Times New Roman"/>
-          <w:sz w:val="18"/>
-          <w:szCs w:val="18"/>
-        </w:rPr>
-        <w:t xml:space="preserve">Rysunek </w:t>
-      </w:r>
-      <w:r>
-        <w:rPr>
-          <w:rFonts w:ascii="Times New Roman" w:hAnsi="Times New Roman" w:cs="Times New Roman"/>
-          <w:sz w:val="18"/>
-          <w:szCs w:val="18"/>
-        </w:rPr>
-        <w:fldChar w:fldCharType="begin"/>
-      </w:r>
-      <w:r>
-        <w:rPr>
-          <w:rFonts w:ascii="Times New Roman" w:hAnsi="Times New Roman" w:cs="Times New Roman"/>
-          <w:sz w:val="18"/>
-          <w:szCs w:val="18"/>
-        </w:rPr>
-        <w:instrText xml:space="preserve"> STYLEREF 1 \s </w:instrText>
-      </w:r>
-      <w:r>
-        <w:rPr>
-          <w:rFonts w:ascii="Times New Roman" w:hAnsi="Times New Roman" w:cs="Times New Roman"/>
-          <w:sz w:val="18"/>
-          <w:szCs w:val="18"/>
-        </w:rPr>
-        <w:fldChar w:fldCharType="separate"/>
-      </w:r>
-      <w:r>
-        <w:rPr>
-          <w:rFonts w:ascii="Times New Roman" w:hAnsi="Times New Roman" w:cs="Times New Roman"/>
-          <w:noProof/>
-          <w:sz w:val="18"/>
-          <w:szCs w:val="18"/>
-        </w:rPr>
-        <w:t>3</w:t>
-      </w:r>
-      <w:r>
-        <w:rPr>
-          <w:rFonts w:ascii="Times New Roman" w:hAnsi="Times New Roman" w:cs="Times New Roman"/>
-          <w:sz w:val="18"/>
-          <w:szCs w:val="18"/>
-        </w:rPr>
-        <w:fldChar w:fldCharType="end"/>
-      </w:r>
-      <w:r>
-        <w:rPr>
-          <w:rFonts w:ascii="Times New Roman" w:hAnsi="Times New Roman" w:cs="Times New Roman"/>
-          <w:sz w:val="18"/>
-          <w:szCs w:val="18"/>
-        </w:rPr>
-        <w:t>.</w:t>
-      </w:r>
-      <w:r>
-        <w:rPr>
-          <w:rFonts w:ascii="Times New Roman" w:hAnsi="Times New Roman" w:cs="Times New Roman"/>
-          <w:sz w:val="18"/>
-          <w:szCs w:val="18"/>
-        </w:rPr>
-        <w:fldChar w:fldCharType="begin"/>
-      </w:r>
-      <w:r>
-        <w:rPr>
-          <w:rFonts w:ascii="Times New Roman" w:hAnsi="Times New Roman" w:cs="Times New Roman"/>
-          <w:sz w:val="18"/>
-          <w:szCs w:val="18"/>
-        </w:rPr>
-        <w:instrText xml:space="preserve"> SEQ Rysunek \* ARABIC \s 1 </w:instrText>
-      </w:r>
-      <w:r>
-        <w:rPr>
-          <w:rFonts w:ascii="Times New Roman" w:hAnsi="Times New Roman" w:cs="Times New Roman"/>
-          <w:sz w:val="18"/>
-          <w:szCs w:val="18"/>
-        </w:rPr>
-        <w:fldChar w:fldCharType="separate"/>
-      </w:r>
-      <w:r>
-        <w:rPr>
-          <w:rFonts w:ascii="Times New Roman" w:hAnsi="Times New Roman" w:cs="Times New Roman"/>
-          <w:noProof/>
-          <w:sz w:val="18"/>
-          <w:szCs w:val="18"/>
-        </w:rPr>
-        <w:t>2</w:t>
-      </w:r>
-      <w:r>
-        <w:rPr>
-          <w:rFonts w:ascii="Times New Roman" w:hAnsi="Times New Roman" w:cs="Times New Roman"/>
-          <w:sz w:val="18"/>
-          <w:szCs w:val="18"/>
-        </w:rPr>
-        <w:fldChar w:fldCharType="end"/>
-      </w:r>
-      <w:r>
-        <w:rPr>
-          <w:rFonts w:ascii="Times New Roman" w:hAnsi="Times New Roman" w:cs="Times New Roman"/>
-          <w:sz w:val="18"/>
-          <w:szCs w:val="18"/>
-        </w:rPr>
-        <w:t xml:space="preserve"> </w:t>
-      </w:r>
-      <w:r>
-        <w:rPr>
-          <w:rFonts w:ascii="Times New Roman" w:hAnsi="Times New Roman" w:cs="Times New Roman"/>
-          <w:sz w:val="18"/>
-          <w:szCs w:val="18"/>
-        </w:rPr>
-        <w:t>Okno</w:t>
-      </w:r>
-      <w:r>
-        <w:rPr>
-          <w:rFonts w:ascii="Times New Roman" w:hAnsi="Times New Roman" w:cs="Times New Roman"/>
-          <w:sz w:val="18"/>
-          <w:szCs w:val="18"/>
-        </w:rPr>
-        <w:t xml:space="preserve"> po załadowaniu JSON i wygenerowaniu schematu</w:t>
-      </w:r>
-      <w:bookmarkEnd w:id="33"/>
-    </w:p>
-    <w:p>
-      <w:pPr>
-        <w:rPr>
-          <w:rFonts w:ascii="Times New Roman" w:hAnsi="Times New Roman"/>
-        </w:rPr>
-      </w:pPr>
-      <w:r>
-        <w:rPr>
-          <w:rFonts w:ascii="Times New Roman" w:hAnsi="Times New Roman"/>
-          <w:b/>
-          <w:bCs/>
-        </w:rPr>
-        <w:t>Generowanie schematu.</w:t>
-      </w:r>
-      <w:r>
-        <w:rPr>
-          <w:rFonts w:ascii="Times New Roman" w:hAnsi="Times New Roman"/>
-        </w:rPr>
-        <w:t xml:space="preserve"> Po wczytaniu pliku dostępne stają się przyciski generowania schematu. Przycisk „Generuj schemat” tworzy schemat na podstawie pojedynczego dokumentu. Przycisk „Generuj dla wielu” przeznaczony jest dla plików zawierających tablicę dokumentów - na ich podstawie powstaje wspólny schemat, w którym dodatkowo wyznaczana jest lista pól wymaganych. Wygenerowany schemat zostaje wyświetlony zarówno w postaci sformatowanego tekstu w prawej kolumnie okna, jak i w postaci drzewa w zakładce „Schemat”.</w:t>
-      </w:r>
-    </w:p>
-    <w:p>
-      <w:pPr>
-        <w:keepNext/>
-        <w:jc w:val="center"/>
-      </w:pPr>
-      <w:r>
-        <w:rPr>
-          <w:rFonts w:ascii="Times New Roman" w:hAnsi="Times New Roman"/>
-          <w:noProof/>
-        </w:rPr>
-        <w:lastRenderedPageBreak/>
-        <w:drawing>
-          <wp:inline distT="0" distB="0" distL="0" distR="0" wp14:anchorId="59960BCC" wp14:editId="39CBC2B3">
-            <wp:extent cx="3668838" cy="4374942"/>
-            <wp:effectExtent l="0" t="0" r="8255" b="6985"/>
-            <wp:docPr id="247357375" name="Obraz 1"/>
-            <wp:cNvGraphicFramePr>
-              <a:graphicFrameLocks xmlns:a="http://schemas.openxmlformats.org/drawingml/2006/main" noChangeAspect="1"/>
-            </wp:cNvGraphicFramePr>
-            <a:graphic xmlns:a="http://schemas.openxmlformats.org/drawingml/2006/main">
-              <a:graphicData uri="http://schemas.openxmlformats.org/drawingml/2006/picture">
-                <pic:pic xmlns:pic="http://schemas.openxmlformats.org/drawingml/2006/picture">
-                  <pic:nvPicPr>
-                    <pic:cNvPr id="247357375" name=""/>
-                    <pic:cNvPicPr/>
-                  </pic:nvPicPr>
-                  <pic:blipFill>
-                    <a:blip r:embed="rId11"/>
-                    <a:stretch>
-                      <a:fillRect/>
-                    </a:stretch>
-                  </pic:blipFill>
-                  <pic:spPr>
-                    <a:xfrm>
-                      <a:off x="0" y="0"/>
-                      <a:ext cx="3671034" cy="4377561"/>
-                    </a:xfrm>
-                    <a:prstGeom prst="rect">
-                      <a:avLst/>
-                    </a:prstGeom>
-                  </pic:spPr>
-                </pic:pic>
-              </a:graphicData>
-            </a:graphic>
-          </wp:inline>
-        </w:drawing>
-      </w:r>
-    </w:p>
-    <w:p>
-      <w:pPr>
-        <w:pStyle w:val="Legenda"/>
-        <w:jc w:val="center"/>
-        <w:rPr>
-          <w:rFonts w:ascii="Times New Roman" w:hAnsi="Times New Roman" w:cs="Times New Roman"/>
-          <w:sz w:val="18"/>
-          <w:szCs w:val="18"/>
-        </w:rPr>
-      </w:pPr>
-      <w:bookmarkStart w:id="34" w:name="_Toc232609750"/>
-      <w:r>
-        <w:rPr>
-          <w:rFonts w:ascii="Times New Roman" w:hAnsi="Times New Roman" w:cs="Times New Roman"/>
-          <w:sz w:val="18"/>
-          <w:szCs w:val="18"/>
-        </w:rPr>
-        <w:t xml:space="preserve">Rysunek </w:t>
-      </w:r>
-      <w:r>
-        <w:rPr>
-          <w:rFonts w:ascii="Times New Roman" w:hAnsi="Times New Roman" w:cs="Times New Roman"/>
-          <w:sz w:val="18"/>
-          <w:szCs w:val="18"/>
-        </w:rPr>
-        <w:fldChar w:fldCharType="begin"/>
-      </w:r>
-      <w:r>
-        <w:rPr>
-          <w:rFonts w:ascii="Times New Roman" w:hAnsi="Times New Roman" w:cs="Times New Roman"/>
-          <w:sz w:val="18"/>
-          <w:szCs w:val="18"/>
-        </w:rPr>
-        <w:instrText xml:space="preserve"> STYLEREF 1 \s </w:instrText>
-      </w:r>
-      <w:r>
-        <w:rPr>
-          <w:rFonts w:ascii="Times New Roman" w:hAnsi="Times New Roman" w:cs="Times New Roman"/>
-          <w:sz w:val="18"/>
-          <w:szCs w:val="18"/>
-        </w:rPr>
-        <w:fldChar w:fldCharType="separate"/>
-      </w:r>
-      <w:r>
-        <w:rPr>
-          <w:rFonts w:ascii="Times New Roman" w:hAnsi="Times New Roman" w:cs="Times New Roman"/>
-          <w:noProof/>
-          <w:sz w:val="18"/>
-          <w:szCs w:val="18"/>
-        </w:rPr>
-        <w:t>3</w:t>
-      </w:r>
-      <w:r>
-        <w:rPr>
-          <w:rFonts w:ascii="Times New Roman" w:hAnsi="Times New Roman" w:cs="Times New Roman"/>
-          <w:sz w:val="18"/>
-          <w:szCs w:val="18"/>
-        </w:rPr>
-        <w:fldChar w:fldCharType="end"/>
-      </w:r>
-      <w:r>
-        <w:rPr>
-          <w:rFonts w:ascii="Times New Roman" w:hAnsi="Times New Roman" w:cs="Times New Roman"/>
-          <w:sz w:val="18"/>
-          <w:szCs w:val="18"/>
-        </w:rPr>
-        <w:t>.</w:t>
-      </w:r>
-      <w:r>
-        <w:rPr>
-          <w:rFonts w:ascii="Times New Roman" w:hAnsi="Times New Roman" w:cs="Times New Roman"/>
-          <w:sz w:val="18"/>
-          <w:szCs w:val="18"/>
-        </w:rPr>
-        <w:fldChar w:fldCharType="begin"/>
-      </w:r>
-      <w:r>
-        <w:rPr>
-          <w:rFonts w:ascii="Times New Roman" w:hAnsi="Times New Roman" w:cs="Times New Roman"/>
-          <w:sz w:val="18"/>
-          <w:szCs w:val="18"/>
-        </w:rPr>
-        <w:instrText xml:space="preserve"> SEQ Rysunek \* ARABIC \s 1 </w:instrText>
-      </w:r>
-      <w:r>
-        <w:rPr>
-          <w:rFonts w:ascii="Times New Roman" w:hAnsi="Times New Roman" w:cs="Times New Roman"/>
-          <w:sz w:val="18"/>
-          <w:szCs w:val="18"/>
-        </w:rPr>
-        <w:fldChar w:fldCharType="separate"/>
-      </w:r>
-      <w:r>
-        <w:rPr>
-          <w:rFonts w:ascii="Times New Roman" w:hAnsi="Times New Roman" w:cs="Times New Roman"/>
-          <w:noProof/>
-          <w:sz w:val="18"/>
-          <w:szCs w:val="18"/>
-        </w:rPr>
-        <w:t>3</w:t>
-      </w:r>
-      <w:r>
-        <w:rPr>
-          <w:rFonts w:ascii="Times New Roman" w:hAnsi="Times New Roman" w:cs="Times New Roman"/>
-          <w:sz w:val="18"/>
-          <w:szCs w:val="18"/>
-        </w:rPr>
-        <w:fldChar w:fldCharType="end"/>
-      </w:r>
-      <w:r>
-        <w:rPr>
-          <w:rFonts w:ascii="Times New Roman" w:hAnsi="Times New Roman" w:cs="Times New Roman"/>
-          <w:sz w:val="18"/>
-          <w:szCs w:val="18"/>
-        </w:rPr>
-        <w:t xml:space="preserve"> Okno edycji</w:t>
-      </w:r>
-      <w:bookmarkEnd w:id="34"/>
-    </w:p>
-    <w:p>
-      <w:pPr>
-        <w:rPr>
-          <w:rFonts w:ascii="Times New Roman" w:hAnsi="Times New Roman"/>
-        </w:rPr>
-      </w:pPr>
-      <w:r>
-        <w:rPr>
-          <w:rFonts w:ascii="Times New Roman" w:hAnsi="Times New Roman"/>
-          <w:b/>
-          <w:bCs/>
-        </w:rPr>
-        <w:t>Edycja schematu.</w:t>
-      </w:r>
-      <w:r>
-        <w:rPr>
-          <w:rFonts w:ascii="Times New Roman" w:hAnsi="Times New Roman"/>
-        </w:rPr>
-        <w:t xml:space="preserve"> Przycisk „Edytuj schemat” otwiera dodatkowe okno pozwalające oznaczyć, które pola mają być wymagane. Pola prezentowane są w postaci listy pól wyboru odwzorowującej strukturę schematu, z uwzględnieniem zagnieżdżonych obiektów oraz elementów tablic. Po zatwierdzeniu zmian przyciskiem „Zastosuj zmiany” schemat zostaje zaktualizowany o właściwość </w:t>
-      </w:r>
-      <w:proofErr w:type="spellStart"/>
-      <w:r>
-        <w:rPr>
-          <w:rFonts w:ascii="Times New Roman" w:hAnsi="Times New Roman"/>
-        </w:rPr>
-        <w:t>required</w:t>
-      </w:r>
-      <w:proofErr w:type="spellEnd"/>
-      <w:r>
-        <w:rPr>
-          <w:rFonts w:ascii="Times New Roman" w:hAnsi="Times New Roman"/>
-        </w:rPr>
-        <w:t>, a zmodyfikowana wersja jest widoczna w oknie głównym.</w:t>
-      </w:r>
-    </w:p>
-    <w:p>
-      <w:pPr>
-        <w:spacing w:after="0" w:line="240" w:lineRule="auto"/>
-        <w:rPr>
-          <w:rFonts w:ascii="Times New Roman" w:hAnsi="Times New Roman"/>
-        </w:rPr>
-      </w:pPr>
-      <w:r>
-        <w:rPr>
-          <w:rFonts w:ascii="Times New Roman" w:hAnsi="Times New Roman"/>
-        </w:rPr>
-        <w:br w:type="page"/>
-      </w:r>
-    </w:p>
-    <w:p>
-      <w:pPr>
-        <w:keepNext/>
-      </w:pPr>
-      <w:r>
-        <w:rPr>
-          <w:noProof/>
-        </w:rPr>
-        <w:lastRenderedPageBreak/>
-        <w:drawing>
-          <wp:inline distT="0" distB="0" distL="0" distR="0" wp14:anchorId="61900B45" wp14:editId="32671CD7">
-            <wp:extent cx="5760720" cy="3354070"/>
-            <wp:effectExtent l="0" t="0" r="0" b="0"/>
-            <wp:docPr id="1799036886" name="Obraz 1"/>
-            <wp:cNvGraphicFramePr>
-              <a:graphicFrameLocks xmlns:a="http://schemas.openxmlformats.org/drawingml/2006/main" noChangeAspect="1"/>
-            </wp:cNvGraphicFramePr>
-            <a:graphic xmlns:a="http://schemas.openxmlformats.org/drawingml/2006/main">
-              <a:graphicData uri="http://schemas.openxmlformats.org/drawingml/2006/picture">
-                <pic:pic xmlns:pic="http://schemas.openxmlformats.org/drawingml/2006/picture">
-                  <pic:nvPicPr>
-                    <pic:cNvPr id="1799036886" name=""/>
                     <pic:cNvPicPr/>
                   </pic:nvPicPr>
                   <pic:blipFill>
@@ -21946,6 +21519,424 @@
           <w:szCs w:val="18"/>
         </w:rPr>
       </w:pPr>
+      <w:bookmarkStart w:id="33" w:name="_Toc232609749"/>
+      <w:r>
+        <w:rPr>
+          <w:rFonts w:ascii="Times New Roman" w:hAnsi="Times New Roman" w:cs="Times New Roman"/>
+          <w:sz w:val="18"/>
+          <w:szCs w:val="18"/>
+        </w:rPr>
+        <w:t xml:space="preserve">Rysunek </w:t>
+      </w:r>
+      <w:r>
+        <w:rPr>
+          <w:rFonts w:ascii="Times New Roman" w:hAnsi="Times New Roman" w:cs="Times New Roman"/>
+          <w:sz w:val="18"/>
+          <w:szCs w:val="18"/>
+        </w:rPr>
+        <w:fldChar w:fldCharType="begin"/>
+      </w:r>
+      <w:r>
+        <w:rPr>
+          <w:rFonts w:ascii="Times New Roman" w:hAnsi="Times New Roman" w:cs="Times New Roman"/>
+          <w:sz w:val="18"/>
+          <w:szCs w:val="18"/>
+        </w:rPr>
+        <w:instrText xml:space="preserve"> STYLEREF 1 \s </w:instrText>
+      </w:r>
+      <w:r>
+        <w:rPr>
+          <w:rFonts w:ascii="Times New Roman" w:hAnsi="Times New Roman" w:cs="Times New Roman"/>
+          <w:sz w:val="18"/>
+          <w:szCs w:val="18"/>
+        </w:rPr>
+        <w:fldChar w:fldCharType="separate"/>
+      </w:r>
+      <w:r>
+        <w:rPr>
+          <w:rFonts w:ascii="Times New Roman" w:hAnsi="Times New Roman" w:cs="Times New Roman"/>
+          <w:noProof/>
+          <w:sz w:val="18"/>
+          <w:szCs w:val="18"/>
+        </w:rPr>
+        <w:t>3</w:t>
+      </w:r>
+      <w:r>
+        <w:rPr>
+          <w:rFonts w:ascii="Times New Roman" w:hAnsi="Times New Roman" w:cs="Times New Roman"/>
+          <w:sz w:val="18"/>
+          <w:szCs w:val="18"/>
+        </w:rPr>
+        <w:fldChar w:fldCharType="end"/>
+      </w:r>
+      <w:r>
+        <w:rPr>
+          <w:rFonts w:ascii="Times New Roman" w:hAnsi="Times New Roman" w:cs="Times New Roman"/>
+          <w:sz w:val="18"/>
+          <w:szCs w:val="18"/>
+        </w:rPr>
+        <w:t>.</w:t>
+      </w:r>
+      <w:r>
+        <w:rPr>
+          <w:rFonts w:ascii="Times New Roman" w:hAnsi="Times New Roman" w:cs="Times New Roman"/>
+          <w:sz w:val="18"/>
+          <w:szCs w:val="18"/>
+        </w:rPr>
+        <w:fldChar w:fldCharType="begin"/>
+      </w:r>
+      <w:r>
+        <w:rPr>
+          <w:rFonts w:ascii="Times New Roman" w:hAnsi="Times New Roman" w:cs="Times New Roman"/>
+          <w:sz w:val="18"/>
+          <w:szCs w:val="18"/>
+        </w:rPr>
+        <w:instrText xml:space="preserve"> SEQ Rysunek \* ARABIC \s 1 </w:instrText>
+      </w:r>
+      <w:r>
+        <w:rPr>
+          <w:rFonts w:ascii="Times New Roman" w:hAnsi="Times New Roman" w:cs="Times New Roman"/>
+          <w:sz w:val="18"/>
+          <w:szCs w:val="18"/>
+        </w:rPr>
+        <w:fldChar w:fldCharType="separate"/>
+      </w:r>
+      <w:r>
+        <w:rPr>
+          <w:rFonts w:ascii="Times New Roman" w:hAnsi="Times New Roman" w:cs="Times New Roman"/>
+          <w:noProof/>
+          <w:sz w:val="18"/>
+          <w:szCs w:val="18"/>
+        </w:rPr>
+        <w:t>2</w:t>
+      </w:r>
+      <w:r>
+        <w:rPr>
+          <w:rFonts w:ascii="Times New Roman" w:hAnsi="Times New Roman" w:cs="Times New Roman"/>
+          <w:sz w:val="18"/>
+          <w:szCs w:val="18"/>
+        </w:rPr>
+        <w:fldChar w:fldCharType="end"/>
+      </w:r>
+      <w:r>
+        <w:rPr>
+          <w:rFonts w:ascii="Times New Roman" w:hAnsi="Times New Roman" w:cs="Times New Roman"/>
+          <w:sz w:val="18"/>
+          <w:szCs w:val="18"/>
+        </w:rPr>
+        <w:t xml:space="preserve"> </w:t>
+      </w:r>
+      <w:r>
+        <w:rPr>
+          <w:rFonts w:ascii="Times New Roman" w:hAnsi="Times New Roman" w:cs="Times New Roman"/>
+          <w:sz w:val="18"/>
+          <w:szCs w:val="18"/>
+        </w:rPr>
+        <w:t>Okno</w:t>
+      </w:r>
+      <w:r>
+        <w:rPr>
+          <w:rFonts w:ascii="Times New Roman" w:hAnsi="Times New Roman" w:cs="Times New Roman"/>
+          <w:sz w:val="18"/>
+          <w:szCs w:val="18"/>
+        </w:rPr>
+        <w:t xml:space="preserve"> po załadowaniu JSON i wygenerowaniu schematu</w:t>
+      </w:r>
+      <w:bookmarkEnd w:id="33"/>
+    </w:p>
+    <w:p>
+      <w:pPr>
+        <w:rPr>
+          <w:rFonts w:ascii="Times New Roman" w:hAnsi="Times New Roman"/>
+        </w:rPr>
+      </w:pPr>
+      <w:r>
+        <w:rPr>
+          <w:rFonts w:ascii="Times New Roman" w:hAnsi="Times New Roman"/>
+          <w:b/>
+          <w:bCs/>
+        </w:rPr>
+        <w:t>Generowanie schematu.</w:t>
+      </w:r>
+      <w:r>
+        <w:rPr>
+          <w:rFonts w:ascii="Times New Roman" w:hAnsi="Times New Roman"/>
+        </w:rPr>
+        <w:t xml:space="preserve"> Po wczytaniu pliku dostępne stają się przyciski generowania schematu. Przycisk „Generuj schemat” tworzy schemat na podstawie pojedynczego dokumentu. Przycisk „Generuj dla wielu” przeznaczony jest dla plików zawierających tablicę dokumentów - na ich podstawie powstaje wspólny schemat, w którym dodatkowo wyznaczana jest lista pól wymaganych. Wygenerowany schemat zostaje wyświetlony zarówno w postaci sformatowanego tekstu w prawej kolumnie okna, jak i w postaci drzewa w zakładce „Schemat”.</w:t>
+      </w:r>
+    </w:p>
+    <w:p>
+      <w:pPr>
+        <w:keepNext/>
+        <w:jc w:val="center"/>
+      </w:pPr>
+      <w:r>
+        <w:rPr>
+          <w:rFonts w:ascii="Times New Roman" w:hAnsi="Times New Roman"/>
+          <w:noProof/>
+        </w:rPr>
+        <w:lastRenderedPageBreak/>
+        <w:drawing>
+          <wp:inline distT="0" distB="0" distL="0" distR="0" wp14:anchorId="59960BCC" wp14:editId="39CBC2B3">
+            <wp:extent cx="3668838" cy="4374942"/>
+            <wp:effectExtent l="0" t="0" r="8255" b="6985"/>
+            <wp:docPr id="247357375" name="Obraz 1"/>
+            <wp:cNvGraphicFramePr>
+              <a:graphicFrameLocks xmlns:a="http://schemas.openxmlformats.org/drawingml/2006/main" noChangeAspect="1"/>
+            </wp:cNvGraphicFramePr>
+            <a:graphic xmlns:a="http://schemas.openxmlformats.org/drawingml/2006/main">
+              <a:graphicData uri="http://schemas.openxmlformats.org/drawingml/2006/picture">
+                <pic:pic xmlns:pic="http://schemas.openxmlformats.org/drawingml/2006/picture">
+                  <pic:nvPicPr>
+                    <pic:cNvPr id="247357375" name=""/>
+                    <pic:cNvPicPr/>
+                  </pic:nvPicPr>
+                  <pic:blipFill>
+                    <a:blip r:embed="rId13"/>
+                    <a:stretch>
+                      <a:fillRect/>
+                    </a:stretch>
+                  </pic:blipFill>
+                  <pic:spPr>
+                    <a:xfrm>
+                      <a:off x="0" y="0"/>
+                      <a:ext cx="3671034" cy="4377561"/>
+                    </a:xfrm>
+                    <a:prstGeom prst="rect">
+                      <a:avLst/>
+                    </a:prstGeom>
+                  </pic:spPr>
+                </pic:pic>
+              </a:graphicData>
+            </a:graphic>
+          </wp:inline>
+        </w:drawing>
+      </w:r>
+    </w:p>
+    <w:p>
+      <w:pPr>
+        <w:pStyle w:val="Legenda"/>
+        <w:jc w:val="center"/>
+        <w:rPr>
+          <w:rFonts w:ascii="Times New Roman" w:hAnsi="Times New Roman" w:cs="Times New Roman"/>
+          <w:sz w:val="18"/>
+          <w:szCs w:val="18"/>
+        </w:rPr>
+      </w:pPr>
+      <w:bookmarkStart w:id="34" w:name="_Toc232609750"/>
+      <w:r>
+        <w:rPr>
+          <w:rFonts w:ascii="Times New Roman" w:hAnsi="Times New Roman" w:cs="Times New Roman"/>
+          <w:sz w:val="18"/>
+          <w:szCs w:val="18"/>
+        </w:rPr>
+        <w:t xml:space="preserve">Rysunek </w:t>
+      </w:r>
+      <w:r>
+        <w:rPr>
+          <w:rFonts w:ascii="Times New Roman" w:hAnsi="Times New Roman" w:cs="Times New Roman"/>
+          <w:sz w:val="18"/>
+          <w:szCs w:val="18"/>
+        </w:rPr>
+        <w:fldChar w:fldCharType="begin"/>
+      </w:r>
+      <w:r>
+        <w:rPr>
+          <w:rFonts w:ascii="Times New Roman" w:hAnsi="Times New Roman" w:cs="Times New Roman"/>
+          <w:sz w:val="18"/>
+          <w:szCs w:val="18"/>
+        </w:rPr>
+        <w:instrText xml:space="preserve"> STYLEREF 1 \s </w:instrText>
+      </w:r>
+      <w:r>
+        <w:rPr>
+          <w:rFonts w:ascii="Times New Roman" w:hAnsi="Times New Roman" w:cs="Times New Roman"/>
+          <w:sz w:val="18"/>
+          <w:szCs w:val="18"/>
+        </w:rPr>
+        <w:fldChar w:fldCharType="separate"/>
+      </w:r>
+      <w:r>
+        <w:rPr>
+          <w:rFonts w:ascii="Times New Roman" w:hAnsi="Times New Roman" w:cs="Times New Roman"/>
+          <w:noProof/>
+          <w:sz w:val="18"/>
+          <w:szCs w:val="18"/>
+        </w:rPr>
+        <w:t>3</w:t>
+      </w:r>
+      <w:r>
+        <w:rPr>
+          <w:rFonts w:ascii="Times New Roman" w:hAnsi="Times New Roman" w:cs="Times New Roman"/>
+          <w:sz w:val="18"/>
+          <w:szCs w:val="18"/>
+        </w:rPr>
+        <w:fldChar w:fldCharType="end"/>
+      </w:r>
+      <w:r>
+        <w:rPr>
+          <w:rFonts w:ascii="Times New Roman" w:hAnsi="Times New Roman" w:cs="Times New Roman"/>
+          <w:sz w:val="18"/>
+          <w:szCs w:val="18"/>
+        </w:rPr>
+        <w:t>.</w:t>
+      </w:r>
+      <w:r>
+        <w:rPr>
+          <w:rFonts w:ascii="Times New Roman" w:hAnsi="Times New Roman" w:cs="Times New Roman"/>
+          <w:sz w:val="18"/>
+          <w:szCs w:val="18"/>
+        </w:rPr>
+        <w:fldChar w:fldCharType="begin"/>
+      </w:r>
+      <w:r>
+        <w:rPr>
+          <w:rFonts w:ascii="Times New Roman" w:hAnsi="Times New Roman" w:cs="Times New Roman"/>
+          <w:sz w:val="18"/>
+          <w:szCs w:val="18"/>
+        </w:rPr>
+        <w:instrText xml:space="preserve"> SEQ Rysunek \* ARABIC \s 1 </w:instrText>
+      </w:r>
+      <w:r>
+        <w:rPr>
+          <w:rFonts w:ascii="Times New Roman" w:hAnsi="Times New Roman" w:cs="Times New Roman"/>
+          <w:sz w:val="18"/>
+          <w:szCs w:val="18"/>
+        </w:rPr>
+        <w:fldChar w:fldCharType="separate"/>
+      </w:r>
+      <w:r>
+        <w:rPr>
+          <w:rFonts w:ascii="Times New Roman" w:hAnsi="Times New Roman" w:cs="Times New Roman"/>
+          <w:noProof/>
+          <w:sz w:val="18"/>
+          <w:szCs w:val="18"/>
+        </w:rPr>
+        <w:t>3</w:t>
+      </w:r>
+      <w:r>
+        <w:rPr>
+          <w:rFonts w:ascii="Times New Roman" w:hAnsi="Times New Roman" w:cs="Times New Roman"/>
+          <w:sz w:val="18"/>
+          <w:szCs w:val="18"/>
+        </w:rPr>
+        <w:fldChar w:fldCharType="end"/>
+      </w:r>
+      <w:r>
+        <w:rPr>
+          <w:rFonts w:ascii="Times New Roman" w:hAnsi="Times New Roman" w:cs="Times New Roman"/>
+          <w:sz w:val="18"/>
+          <w:szCs w:val="18"/>
+        </w:rPr>
+        <w:t xml:space="preserve"> Okno edycji</w:t>
+      </w:r>
+      <w:bookmarkEnd w:id="34"/>
+    </w:p>
+    <w:p>
+      <w:pPr>
+        <w:rPr>
+          <w:rFonts w:ascii="Times New Roman" w:hAnsi="Times New Roman"/>
+        </w:rPr>
+      </w:pPr>
+      <w:r>
+        <w:rPr>
+          <w:rFonts w:ascii="Times New Roman" w:hAnsi="Times New Roman"/>
+          <w:b/>
+          <w:bCs/>
+        </w:rPr>
+        <w:t>Edycja schematu.</w:t>
+      </w:r>
+      <w:r>
+        <w:rPr>
+          <w:rFonts w:ascii="Times New Roman" w:hAnsi="Times New Roman"/>
+        </w:rPr>
+        <w:t xml:space="preserve"> Przycisk „Edytuj schemat” otwiera dodatkowe okno pozwalające oznaczyć, które pola mają być wymagane. Pola prezentowane są w postaci listy pól wyboru odwzorowującej strukturę schematu, z uwzględnieniem zagnieżdżonych obiektów oraz elementów tablic. Po zatwierdzeniu zmian przyciskiem „Zastosuj zmiany” schemat zostaje zaktualizowany o właściwość </w:t>
+      </w:r>
+      <w:proofErr w:type="spellStart"/>
+      <w:r>
+        <w:rPr>
+          <w:rFonts w:ascii="Times New Roman" w:hAnsi="Times New Roman"/>
+        </w:rPr>
+        <w:t>required</w:t>
+      </w:r>
+      <w:proofErr w:type="spellEnd"/>
+      <w:r>
+        <w:rPr>
+          <w:rFonts w:ascii="Times New Roman" w:hAnsi="Times New Roman"/>
+        </w:rPr>
+        <w:t>, a zmodyfikowana wersja jest widoczna w oknie głównym.</w:t>
+      </w:r>
+    </w:p>
+    <w:p>
+      <w:pPr>
+        <w:spacing w:after="0" w:line="240" w:lineRule="auto"/>
+        <w:rPr>
+          <w:rFonts w:ascii="Times New Roman" w:hAnsi="Times New Roman"/>
+        </w:rPr>
+      </w:pPr>
+      <w:r>
+        <w:rPr>
+          <w:rFonts w:ascii="Times New Roman" w:hAnsi="Times New Roman"/>
+        </w:rPr>
+        <w:br w:type="page"/>
+      </w:r>
+    </w:p>
+    <w:p>
+      <w:pPr>
+        <w:keepNext/>
+      </w:pPr>
+      <w:r>
+        <w:rPr>
+          <w:noProof/>
+        </w:rPr>
+        <w:lastRenderedPageBreak/>
+        <w:drawing>
+          <wp:inline distT="0" distB="0" distL="0" distR="0" wp14:anchorId="61900B45" wp14:editId="32671CD7">
+            <wp:extent cx="5760720" cy="3354070"/>
+            <wp:effectExtent l="0" t="0" r="0" b="0"/>
+            <wp:docPr id="1799036886" name="Obraz 1"/>
+            <wp:cNvGraphicFramePr>
+              <a:graphicFrameLocks xmlns:a="http://schemas.openxmlformats.org/drawingml/2006/main" noChangeAspect="1"/>
+            </wp:cNvGraphicFramePr>
+            <a:graphic xmlns:a="http://schemas.openxmlformats.org/drawingml/2006/main">
+              <a:graphicData uri="http://schemas.openxmlformats.org/drawingml/2006/picture">
+                <pic:pic xmlns:pic="http://schemas.openxmlformats.org/drawingml/2006/picture">
+                  <pic:nvPicPr>
+                    <pic:cNvPr id="1799036886" name=""/>
+                    <pic:cNvPicPr/>
+                  </pic:nvPicPr>
+                  <pic:blipFill>
+                    <a:blip r:embed="rId14"/>
+                    <a:stretch>
+                      <a:fillRect/>
+                    </a:stretch>
+                  </pic:blipFill>
+                  <pic:spPr>
+                    <a:xfrm>
+                      <a:off x="0" y="0"/>
+                      <a:ext cx="5760720" cy="3354070"/>
+                    </a:xfrm>
+                    <a:prstGeom prst="rect">
+                      <a:avLst/>
+                    </a:prstGeom>
+                  </pic:spPr>
+                </pic:pic>
+              </a:graphicData>
+            </a:graphic>
+          </wp:inline>
+        </w:drawing>
+      </w:r>
+    </w:p>
+    <w:p>
+      <w:pPr>
+        <w:pStyle w:val="Legenda"/>
+        <w:jc w:val="center"/>
+        <w:rPr>
+          <w:rFonts w:ascii="Times New Roman" w:hAnsi="Times New Roman" w:cs="Times New Roman"/>
+          <w:sz w:val="18"/>
+          <w:szCs w:val="18"/>
+        </w:rPr>
+      </w:pPr>
       <w:bookmarkStart w:id="35" w:name="_Toc232609751"/>
       <w:r>
         <w:rPr>
@@ -22152,7 +22143,7 @@
                     <pic:cNvPicPr/>
                   </pic:nvPicPr>
                   <pic:blipFill>
-                    <a:blip r:embed="rId13"/>
+                    <a:blip r:embed="rId15"/>
                     <a:stretch>
                       <a:fillRect/>
                     </a:stretch>
@@ -23833,6 +23824,12 @@
       </w:pPr>
     </w:p>
     <w:sectPr>
+      <w:headerReference w:type="even" r:id="rId16"/>
+      <w:headerReference w:type="default" r:id="rId17"/>
+      <w:footerReference w:type="even" r:id="rId18"/>
+      <w:footerReference w:type="default" r:id="rId19"/>
+      <w:headerReference w:type="first" r:id="rId20"/>
+      <w:footerReference w:type="first" r:id="rId21"/>
       <w:pgSz w:w="11906" w:h="16838"/>
       <w:pgMar w:top="1417" w:right="1417" w:bottom="1417" w:left="1417" w:header="0" w:footer="0" w:gutter="0"/>
       <w:cols w:space="708"/>
@@ -23841,6 +23838,157 @@
     </w:sectPr>
   </w:body>
 </w:document>
+</file>
+
+<file path=word/endnotes.xml><?xml version="1.0" encoding="utf-8"?>
+<w:endnotes xmlns:wpc="http://schemas.microsoft.com/office/word/2010/wordprocessingCanvas" xmlns:cx="http://schemas.microsoft.com/office/drawing/2014/chartex" xmlns:cx1="http://schemas.microsoft.com/office/drawing/2015/9/8/chartex" xmlns:cx2="http://schemas.microsoft.com/office/drawing/2015/10/21/chartex" xmlns:cx3="http://schemas.microsoft.com/office/drawing/2016/5/9/chartex" xmlns:cx4="http://schemas.microsoft.com/office/drawing/2016/5/10/chartex" xmlns:cx5="http://schemas.microsoft.com/office/drawing/2016/5/11/chartex" xmlns:cx6="http://schemas.microsoft.com/office/drawing/2016/5/12/chartex" xmlns:cx7="http://schemas.microsoft.com/office/drawing/2016/5/13/chartex" xmlns:cx8="http://schemas.microsoft.com/office/drawing/2016/5/14/chartex" xmlns:mc="http://schemas.openxmlformats.org/markup-compatibility/2006" xmlns:aink="http://schemas.microsoft.com/office/drawing/2016/ink" xmlns:am3d="http://schemas.microsoft.com/office/drawing/2017/model3d" xmlns:o="urn:schemas-microsoft-com:office:office" xmlns:oel="http://schemas.microsoft.com/office/2019/extlst" xmlns:r="http://schemas.openxmlformats.org/officeDocument/2006/relationships" xmlns:m="http://schemas.openxmlformats.org/officeDocument/2006/math" xmlns:v="urn:schemas-microsoft-com:vml" xmlns:wp14="http://schemas.microsoft.com/office/word/2010/wordprocessingDrawing" xmlns:wp="http://schemas.openxmlformats.org/drawingml/2006/wordprocessingDrawing" xmlns:w10="urn:schemas-microsoft-com:office:word" xmlns:w="http://schemas.openxmlformats.org/wordprocessingml/2006/main" xmlns:w14="http://schemas.microsoft.com/office/word/2010/wordml" xmlns:w15="http://schemas.microsoft.com/office/word/2012/wordml" xmlns:w16cex="http://schemas.microsoft.com/office/word/2018/wordml/cex" xmlns:w16cid="http://schemas.microsoft.com/office/word/2016/wordml/cid" xmlns:w16="http://schemas.microsoft.com/office/word/2018/wordml" xmlns:w16du="http://schemas.microsoft.com/office/word/2023/wordml/word16du" xmlns:w16sdtdh="http://schemas.microsoft.com/office/word/2020/wordml/sdtdatahash" xmlns:w16sdtfl="http://schemas.microsoft.com/office/word/2024/wordml/sdtformatlock" xmlns:w16se="http://schemas.microsoft.com/office/word/2015/wordml/symex" xmlns:wpg="http://schemas.microsoft.com/office/word/2010/wordprocessingGroup" xmlns:wpi="http://schemas.microsoft.com/office/word/2010/wordprocessingInk" xmlns:wne="http://schemas.microsoft.com/office/word/2006/wordml" xmlns:wps="http://schemas.microsoft.com/office/word/2010/wordprocessingShape" mc:Ignorable="w14 w15 w16se w16cid w16 w16cex w16sdtdh w16sdtfl w16du wp14">
+  <w:endnote w:type="separator" w:id="-1">
+    <w:p>
+      <w:pPr>
+        <w:spacing w:after="0" w:line="240" w:lineRule="auto"/>
+      </w:pPr>
+      <w:r>
+        <w:separator/>
+      </w:r>
+    </w:p>
+  </w:endnote>
+  <w:endnote w:type="continuationSeparator" w:id="0">
+    <w:p>
+      <w:pPr>
+        <w:spacing w:after="0" w:line="240" w:lineRule="auto"/>
+      </w:pPr>
+      <w:r>
+        <w:continuationSeparator/>
+      </w:r>
+    </w:p>
+  </w:endnote>
+</w:endnotes>
+</file>
+
+<file path=word/footer1.xml><?xml version="1.0" encoding="utf-8"?>
+<w:ftr xmlns:wpc="http://schemas.microsoft.com/office/word/2010/wordprocessingCanvas" xmlns:cx="http://schemas.microsoft.com/office/drawing/2014/chartex" xmlns:cx1="http://schemas.microsoft.com/office/drawing/2015/9/8/chartex" xmlns:cx2="http://schemas.microsoft.com/office/drawing/2015/10/21/chartex" xmlns:cx3="http://schemas.microsoft.com/office/drawing/2016/5/9/chartex" xmlns:cx4="http://schemas.microsoft.com/office/drawing/2016/5/10/chartex" xmlns:cx5="http://schemas.microsoft.com/office/drawing/2016/5/11/chartex" xmlns:cx6="http://schemas.microsoft.com/office/drawing/2016/5/12/chartex" xmlns:cx7="http://schemas.microsoft.com/office/drawing/2016/5/13/chartex" xmlns:cx8="http://schemas.microsoft.com/office/drawing/2016/5/14/chartex" xmlns:mc="http://schemas.openxmlformats.org/markup-compatibility/2006" xmlns:aink="http://schemas.microsoft.com/office/drawing/2016/ink" xmlns:am3d="http://schemas.microsoft.com/office/drawing/2017/model3d" xmlns:o="urn:schemas-microsoft-com:office:office" xmlns:oel="http://schemas.microsoft.com/office/2019/extlst" xmlns:r="http://schemas.openxmlformats.org/officeDocument/2006/relationships" xmlns:m="http://schemas.openxmlformats.org/officeDocument/2006/math" xmlns:v="urn:schemas-microsoft-com:vml" xmlns:wp14="http://schemas.microsoft.com/office/word/2010/wordprocessingDrawing" xmlns:wp="http://schemas.openxmlformats.org/drawingml/2006/wordprocessingDrawing" xmlns:w10="urn:schemas-microsoft-com:office:word" xmlns:w="http://schemas.openxmlformats.org/wordprocessingml/2006/main" xmlns:w14="http://schemas.microsoft.com/office/word/2010/wordml" xmlns:w15="http://schemas.microsoft.com/office/word/2012/wordml" xmlns:w16cex="http://schemas.microsoft.com/office/word/2018/wordml/cex" xmlns:w16cid="http://schemas.microsoft.com/office/word/2016/wordml/cid" xmlns:w16="http://schemas.microsoft.com/office/word/2018/wordml" xmlns:w16du="http://schemas.microsoft.com/office/word/2023/wordml/word16du" xmlns:w16sdtdh="http://schemas.microsoft.com/office/word/2020/wordml/sdtdatahash" xmlns:w16sdtfl="http://schemas.microsoft.com/office/word/2024/wordml/sdtformatlock" xmlns:w16se="http://schemas.microsoft.com/office/word/2015/wordml/symex" xmlns:wpg="http://schemas.microsoft.com/office/word/2010/wordprocessingGroup" xmlns:wpi="http://schemas.microsoft.com/office/word/2010/wordprocessingInk" xmlns:wne="http://schemas.microsoft.com/office/word/2006/wordml" xmlns:wps="http://schemas.microsoft.com/office/word/2010/wordprocessingShape" mc:Ignorable="w14 w15 w16se w16cid w16 w16cex w16sdtdh w16sdtfl w16du wp14">
+  <w:p>
+    <w:pPr>
+      <w:pStyle w:val="Stopka"/>
+    </w:pPr>
+  </w:p>
+</w:ftr>
+</file>
+
+<file path=word/footer2.xml><?xml version="1.0" encoding="utf-8"?>
+<w:ftr xmlns:wpc="http://schemas.microsoft.com/office/word/2010/wordprocessingCanvas" xmlns:cx="http://schemas.microsoft.com/office/drawing/2014/chartex" xmlns:cx1="http://schemas.microsoft.com/office/drawing/2015/9/8/chartex" xmlns:cx2="http://schemas.microsoft.com/office/drawing/2015/10/21/chartex" xmlns:cx3="http://schemas.microsoft.com/office/drawing/2016/5/9/chartex" xmlns:cx4="http://schemas.microsoft.com/office/drawing/2016/5/10/chartex" xmlns:cx5="http://schemas.microsoft.com/office/drawing/2016/5/11/chartex" xmlns:cx6="http://schemas.microsoft.com/office/drawing/2016/5/12/chartex" xmlns:cx7="http://schemas.microsoft.com/office/drawing/2016/5/13/chartex" xmlns:cx8="http://schemas.microsoft.com/office/drawing/2016/5/14/chartex" xmlns:mc="http://schemas.openxmlformats.org/markup-compatibility/2006" xmlns:aink="http://schemas.microsoft.com/office/drawing/2016/ink" xmlns:am3d="http://schemas.microsoft.com/office/drawing/2017/model3d" xmlns:o="urn:schemas-microsoft-com:office:office" xmlns:oel="http://schemas.microsoft.com/office/2019/extlst" xmlns:r="http://schemas.openxmlformats.org/officeDocument/2006/relationships" xmlns:m="http://schemas.openxmlformats.org/officeDocument/2006/math" xmlns:v="urn:schemas-microsoft-com:vml" xmlns:wp14="http://schemas.microsoft.com/office/word/2010/wordprocessingDrawing" xmlns:wp="http://schemas.openxmlformats.org/drawingml/2006/wordprocessingDrawing" xmlns:w10="urn:schemas-microsoft-com:office:word" xmlns:w="http://schemas.openxmlformats.org/wordprocessingml/2006/main" xmlns:w14="http://schemas.microsoft.com/office/word/2010/wordml" xmlns:w15="http://schemas.microsoft.com/office/word/2012/wordml" xmlns:w16cex="http://schemas.microsoft.com/office/word/2018/wordml/cex" xmlns:w16cid="http://schemas.microsoft.com/office/word/2016/wordml/cid" xmlns:w16="http://schemas.microsoft.com/office/word/2018/wordml" xmlns:w16du="http://schemas.microsoft.com/office/word/2023/wordml/word16du" xmlns:w16sdtdh="http://schemas.microsoft.com/office/word/2020/wordml/sdtdatahash" xmlns:w16sdtfl="http://schemas.microsoft.com/office/word/2024/wordml/sdtformatlock" xmlns:w16se="http://schemas.microsoft.com/office/word/2015/wordml/symex" xmlns:wpg="http://schemas.microsoft.com/office/word/2010/wordprocessingGroup" xmlns:wpi="http://schemas.microsoft.com/office/word/2010/wordprocessingInk" xmlns:wne="http://schemas.microsoft.com/office/word/2006/wordml" xmlns:wps="http://schemas.microsoft.com/office/word/2010/wordprocessingShape" mc:Ignorable="w14 w15 w16se w16cid w16 w16cex w16sdtdh w16sdtfl w16du wp14">
+  <w:sdt>
+    <w:sdtPr>
+      <w:id w:val="-1274245849"/>
+      <w:docPartObj>
+        <w:docPartGallery w:val="Page Numbers (Bottom of Page)"/>
+        <w:docPartUnique/>
+      </w:docPartObj>
+    </w:sdtPr>
+    <w:sdtContent>
+      <w:p>
+        <w:pPr>
+          <w:pStyle w:val="Stopka"/>
+          <w:jc w:val="right"/>
+        </w:pPr>
+        <w:r>
+          <w:fldChar w:fldCharType="begin"/>
+        </w:r>
+        <w:r>
+          <w:instrText>PAGE   \* MERGEFORMAT</w:instrText>
+        </w:r>
+        <w:r>
+          <w:fldChar w:fldCharType="separate"/>
+        </w:r>
+        <w:r>
+          <w:t>2</w:t>
+        </w:r>
+        <w:r>
+          <w:fldChar w:fldCharType="end"/>
+        </w:r>
+      </w:p>
+    </w:sdtContent>
+  </w:sdt>
+  <w:p>
+    <w:pPr>
+      <w:pStyle w:val="Stopka"/>
+    </w:pPr>
+  </w:p>
+</w:ftr>
+</file>
+
+<file path=word/footer3.xml><?xml version="1.0" encoding="utf-8"?>
+<w:ftr xmlns:wpc="http://schemas.microsoft.com/office/word/2010/wordprocessingCanvas" xmlns:cx="http://schemas.microsoft.com/office/drawing/2014/chartex" xmlns:cx1="http://schemas.microsoft.com/office/drawing/2015/9/8/chartex" xmlns:cx2="http://schemas.microsoft.com/office/drawing/2015/10/21/chartex" xmlns:cx3="http://schemas.microsoft.com/office/drawing/2016/5/9/chartex" xmlns:cx4="http://schemas.microsoft.com/office/drawing/2016/5/10/chartex" xmlns:cx5="http://schemas.microsoft.com/office/drawing/2016/5/11/chartex" xmlns:cx6="http://schemas.microsoft.com/office/drawing/2016/5/12/chartex" xmlns:cx7="http://schemas.microsoft.com/office/drawing/2016/5/13/chartex" xmlns:cx8="http://schemas.microsoft.com/office/drawing/2016/5/14/chartex" xmlns:mc="http://schemas.openxmlformats.org/markup-compatibility/2006" xmlns:aink="http://schemas.microsoft.com/office/drawing/2016/ink" xmlns:am3d="http://schemas.microsoft.com/office/drawing/2017/model3d" xmlns:o="urn:schemas-microsoft-com:office:office" xmlns:oel="http://schemas.microsoft.com/office/2019/extlst" xmlns:r="http://schemas.openxmlformats.org/officeDocument/2006/relationships" xmlns:m="http://schemas.openxmlformats.org/officeDocument/2006/math" xmlns:v="urn:schemas-microsoft-com:vml" xmlns:wp14="http://schemas.microsoft.com/office/word/2010/wordprocessingDrawing" xmlns:wp="http://schemas.openxmlformats.org/drawingml/2006/wordprocessingDrawing" xmlns:w10="urn:schemas-microsoft-com:office:word" xmlns:w="http://schemas.openxmlformats.org/wordprocessingml/2006/main" xmlns:w14="http://schemas.microsoft.com/office/word/2010/wordml" xmlns:w15="http://schemas.microsoft.com/office/word/2012/wordml" xmlns:w16cex="http://schemas.microsoft.com/office/word/2018/wordml/cex" xmlns:w16cid="http://schemas.microsoft.com/office/word/2016/wordml/cid" xmlns:w16="http://schemas.microsoft.com/office/word/2018/wordml" xmlns:w16du="http://schemas.microsoft.com/office/word/2023/wordml/word16du" xmlns:w16sdtdh="http://schemas.microsoft.com/office/word/2020/wordml/sdtdatahash" xmlns:w16sdtfl="http://schemas.microsoft.com/office/word/2024/wordml/sdtformatlock" xmlns:w16se="http://schemas.microsoft.com/office/word/2015/wordml/symex" xmlns:wpg="http://schemas.microsoft.com/office/word/2010/wordprocessingGroup" xmlns:wpi="http://schemas.microsoft.com/office/word/2010/wordprocessingInk" xmlns:wne="http://schemas.microsoft.com/office/word/2006/wordml" xmlns:wps="http://schemas.microsoft.com/office/word/2010/wordprocessingShape" mc:Ignorable="w14 w15 w16se w16cid w16 w16cex w16sdtdh w16sdtfl w16du wp14">
+  <w:p>
+    <w:pPr>
+      <w:pStyle w:val="Stopka"/>
+    </w:pPr>
+  </w:p>
+</w:ftr>
+</file>
+
+<file path=word/footnotes.xml><?xml version="1.0" encoding="utf-8"?>
+<w:footnotes xmlns:wpc="http://schemas.microsoft.com/office/word/2010/wordprocessingCanvas" xmlns:cx="http://schemas.microsoft.com/office/drawing/2014/chartex" xmlns:cx1="http://schemas.microsoft.com/office/drawing/2015/9/8/chartex" xmlns:cx2="http://schemas.microsoft.com/office/drawing/2015/10/21/chartex" xmlns:cx3="http://schemas.microsoft.com/office/drawing/2016/5/9/chartex" xmlns:cx4="http://schemas.microsoft.com/office/drawing/2016/5/10/chartex" xmlns:cx5="http://schemas.microsoft.com/office/drawing/2016/5/11/chartex" xmlns:cx6="http://schemas.microsoft.com/office/drawing/2016/5/12/chartex" xmlns:cx7="http://schemas.microsoft.com/office/drawing/2016/5/13/chartex" xmlns:cx8="http://schemas.microsoft.com/office/drawing/2016/5/14/chartex" xmlns:mc="http://schemas.openxmlformats.org/markup-compatibility/2006" xmlns:aink="http://schemas.microsoft.com/office/drawing/2016/ink" xmlns:am3d="http://schemas.microsoft.com/office/drawing/2017/model3d" xmlns:o="urn:schemas-microsoft-com:office:office" xmlns:oel="http://schemas.microsoft.com/office/2019/extlst" xmlns:r="http://schemas.openxmlformats.org/officeDocument/2006/relationships" xmlns:m="http://schemas.openxmlformats.org/officeDocument/2006/math" xmlns:v="urn:schemas-microsoft-com:vml" xmlns:wp14="http://schemas.microsoft.com/office/word/2010/wordprocessingDrawing" xmlns:wp="http://schemas.openxmlformats.org/drawingml/2006/wordprocessingDrawing" xmlns:w10="urn:schemas-microsoft-com:office:word" xmlns:w="http://schemas.openxmlformats.org/wordprocessingml/2006/main" xmlns:w14="http://schemas.microsoft.com/office/word/2010/wordml" xmlns:w15="http://schemas.microsoft.com/office/word/2012/wordml" xmlns:w16cex="http://schemas.microsoft.com/office/word/2018/wordml/cex" xmlns:w16cid="http://schemas.microsoft.com/office/word/2016/wordml/cid" xmlns:w16="http://schemas.microsoft.com/office/word/2018/wordml" xmlns:w16du="http://schemas.microsoft.com/office/word/2023/wordml/word16du" xmlns:w16sdtdh="http://schemas.microsoft.com/office/word/2020/wordml/sdtdatahash" xmlns:w16sdtfl="http://schemas.microsoft.com/office/word/2024/wordml/sdtformatlock" xmlns:w16se="http://schemas.microsoft.com/office/word/2015/wordml/symex" xmlns:wpg="http://schemas.microsoft.com/office/word/2010/wordprocessingGroup" xmlns:wpi="http://schemas.microsoft.com/office/word/2010/wordprocessingInk" xmlns:wne="http://schemas.microsoft.com/office/word/2006/wordml" xmlns:wps="http://schemas.microsoft.com/office/word/2010/wordprocessingShape" mc:Ignorable="w14 w15 w16se w16cid w16 w16cex w16sdtdh w16sdtfl w16du wp14">
+  <w:footnote w:type="separator" w:id="-1">
+    <w:p>
+      <w:pPr>
+        <w:spacing w:after="0" w:line="240" w:lineRule="auto"/>
+      </w:pPr>
+      <w:r>
+        <w:separator/>
+      </w:r>
+    </w:p>
+  </w:footnote>
+  <w:footnote w:type="continuationSeparator" w:id="0">
+    <w:p>
+      <w:pPr>
+        <w:spacing w:after="0" w:line="240" w:lineRule="auto"/>
+      </w:pPr>
+      <w:r>
+        <w:continuationSeparator/>
+      </w:r>
+    </w:p>
+  </w:footnote>
+</w:footnotes>
+</file>
+
+<file path=word/header1.xml><?xml version="1.0" encoding="utf-8"?>
+<w:hdr xmlns:wpc="http://schemas.microsoft.com/office/word/2010/wordprocessingCanvas" xmlns:cx="http://schemas.microsoft.com/office/drawing/2014/chartex" xmlns:cx1="http://schemas.microsoft.com/office/drawing/2015/9/8/chartex" xmlns:cx2="http://schemas.microsoft.com/office/drawing/2015/10/21/chartex" xmlns:cx3="http://schemas.microsoft.com/office/drawing/2016/5/9/chartex" xmlns:cx4="http://schemas.microsoft.com/office/drawing/2016/5/10/chartex" xmlns:cx5="http://schemas.microsoft.com/office/drawing/2016/5/11/chartex" xmlns:cx6="http://schemas.microsoft.com/office/drawing/2016/5/12/chartex" xmlns:cx7="http://schemas.microsoft.com/office/drawing/2016/5/13/chartex" xmlns:cx8="http://schemas.microsoft.com/office/drawing/2016/5/14/chartex" xmlns:mc="http://schemas.openxmlformats.org/markup-compatibility/2006" xmlns:aink="http://schemas.microsoft.com/office/drawing/2016/ink" xmlns:am3d="http://schemas.microsoft.com/office/drawing/2017/model3d" xmlns:o="urn:schemas-microsoft-com:office:office" xmlns:oel="http://schemas.microsoft.com/office/2019/extlst" xmlns:r="http://schemas.openxmlformats.org/officeDocument/2006/relationships" xmlns:m="http://schemas.openxmlformats.org/officeDocument/2006/math" xmlns:v="urn:schemas-microsoft-com:vml" xmlns:wp14="http://schemas.microsoft.com/office/word/2010/wordprocessingDrawing" xmlns:wp="http://schemas.openxmlformats.org/drawingml/2006/wordprocessingDrawing" xmlns:w10="urn:schemas-microsoft-com:office:word" xmlns:w="http://schemas.openxmlformats.org/wordprocessingml/2006/main" xmlns:w14="http://schemas.microsoft.com/office/word/2010/wordml" xmlns:w15="http://schemas.microsoft.com/office/word/2012/wordml" xmlns:w16cex="http://schemas.microsoft.com/office/word/2018/wordml/cex" xmlns:w16cid="http://schemas.microsoft.com/office/word/2016/wordml/cid" xmlns:w16="http://schemas.microsoft.com/office/word/2018/wordml" xmlns:w16du="http://schemas.microsoft.com/office/word/2023/wordml/word16du" xmlns:w16sdtdh="http://schemas.microsoft.com/office/word/2020/wordml/sdtdatahash" xmlns:w16sdtfl="http://schemas.microsoft.com/office/word/2024/wordml/sdtformatlock" xmlns:w16se="http://schemas.microsoft.com/office/word/2015/wordml/symex" xmlns:wpg="http://schemas.microsoft.com/office/word/2010/wordprocessingGroup" xmlns:wpi="http://schemas.microsoft.com/office/word/2010/wordprocessingInk" xmlns:wne="http://schemas.microsoft.com/office/word/2006/wordml" xmlns:wps="http://schemas.microsoft.com/office/word/2010/wordprocessingShape" mc:Ignorable="w14 w15 w16se w16cid w16 w16cex w16sdtdh w16sdtfl w16du wp14">
+  <w:p>
+    <w:pPr>
+      <w:pStyle w:val="Nagwek"/>
+      <w:rPr>
+        <w:rFonts w:hint="eastAsia"/>
+      </w:rPr>
+    </w:pPr>
+  </w:p>
+</w:hdr>
+</file>
+
+<file path=word/header2.xml><?xml version="1.0" encoding="utf-8"?>
+<w:hdr xmlns:wpc="http://schemas.microsoft.com/office/word/2010/wordprocessingCanvas" xmlns:cx="http://schemas.microsoft.com/office/drawing/2014/chartex" xmlns:cx1="http://schemas.microsoft.com/office/drawing/2015/9/8/chartex" xmlns:cx2="http://schemas.microsoft.com/office/drawing/2015/10/21/chartex" xmlns:cx3="http://schemas.microsoft.com/office/drawing/2016/5/9/chartex" xmlns:cx4="http://schemas.microsoft.com/office/drawing/2016/5/10/chartex" xmlns:cx5="http://schemas.microsoft.com/office/drawing/2016/5/11/chartex" xmlns:cx6="http://schemas.microsoft.com/office/drawing/2016/5/12/chartex" xmlns:cx7="http://schemas.microsoft.com/office/drawing/2016/5/13/chartex" xmlns:cx8="http://schemas.microsoft.com/office/drawing/2016/5/14/chartex" xmlns:mc="http://schemas.openxmlformats.org/markup-compatibility/2006" xmlns:aink="http://schemas.microsoft.com/office/drawing/2016/ink" xmlns:am3d="http://schemas.microsoft.com/office/drawing/2017/model3d" xmlns:o="urn:schemas-microsoft-com:office:office" xmlns:oel="http://schemas.microsoft.com/office/2019/extlst" xmlns:r="http://schemas.openxmlformats.org/officeDocument/2006/relationships" xmlns:m="http://schemas.openxmlformats.org/officeDocument/2006/math" xmlns:v="urn:schemas-microsoft-com:vml" xmlns:wp14="http://schemas.microsoft.com/office/word/2010/wordprocessingDrawing" xmlns:wp="http://schemas.openxmlformats.org/drawingml/2006/wordprocessingDrawing" xmlns:w10="urn:schemas-microsoft-com:office:word" xmlns:w="http://schemas.openxmlformats.org/wordprocessingml/2006/main" xmlns:w14="http://schemas.microsoft.com/office/word/2010/wordml" xmlns:w15="http://schemas.microsoft.com/office/word/2012/wordml" xmlns:w16cex="http://schemas.microsoft.com/office/word/2018/wordml/cex" xmlns:w16cid="http://schemas.microsoft.com/office/word/2016/wordml/cid" xmlns:w16="http://schemas.microsoft.com/office/word/2018/wordml" xmlns:w16du="http://schemas.microsoft.com/office/word/2023/wordml/word16du" xmlns:w16sdtdh="http://schemas.microsoft.com/office/word/2020/wordml/sdtdatahash" xmlns:w16sdtfl="http://schemas.microsoft.com/office/word/2024/wordml/sdtformatlock" xmlns:w16se="http://schemas.microsoft.com/office/word/2015/wordml/symex" xmlns:wpg="http://schemas.microsoft.com/office/word/2010/wordprocessingGroup" xmlns:wpi="http://schemas.microsoft.com/office/word/2010/wordprocessingInk" xmlns:wne="http://schemas.microsoft.com/office/word/2006/wordml" xmlns:wps="http://schemas.microsoft.com/office/word/2010/wordprocessingShape" mc:Ignorable="w14 w15 w16se w16cid w16 w16cex w16sdtdh w16sdtfl w16du wp14">
+  <w:p>
+    <w:pPr>
+      <w:pStyle w:val="Nagwek"/>
+      <w:rPr>
+        <w:rFonts w:hint="eastAsia"/>
+      </w:rPr>
+    </w:pPr>
+  </w:p>
+</w:hdr>
+</file>
+
+<file path=word/header3.xml><?xml version="1.0" encoding="utf-8"?>
+<w:hdr xmlns:wpc="http://schemas.microsoft.com/office/word/2010/wordprocessingCanvas" xmlns:cx="http://schemas.microsoft.com/office/drawing/2014/chartex" xmlns:cx1="http://schemas.microsoft.com/office/drawing/2015/9/8/chartex" xmlns:cx2="http://schemas.microsoft.com/office/drawing/2015/10/21/chartex" xmlns:cx3="http://schemas.microsoft.com/office/drawing/2016/5/9/chartex" xmlns:cx4="http://schemas.microsoft.com/office/drawing/2016/5/10/chartex" xmlns:cx5="http://schemas.microsoft.com/office/drawing/2016/5/11/chartex" xmlns:cx6="http://schemas.microsoft.com/office/drawing/2016/5/12/chartex" xmlns:cx7="http://schemas.microsoft.com/office/drawing/2016/5/13/chartex" xmlns:cx8="http://schemas.microsoft.com/office/drawing/2016/5/14/chartex" xmlns:mc="http://schemas.openxmlformats.org/markup-compatibility/2006" xmlns:aink="http://schemas.microsoft.com/office/drawing/2016/ink" xmlns:am3d="http://schemas.microsoft.com/office/drawing/2017/model3d" xmlns:o="urn:schemas-microsoft-com:office:office" xmlns:oel="http://schemas.microsoft.com/office/2019/extlst" xmlns:r="http://schemas.openxmlformats.org/officeDocument/2006/relationships" xmlns:m="http://schemas.openxmlformats.org/officeDocument/2006/math" xmlns:v="urn:schemas-microsoft-com:vml" xmlns:wp14="http://schemas.microsoft.com/office/word/2010/wordprocessingDrawing" xmlns:wp="http://schemas.openxmlformats.org/drawingml/2006/wordprocessingDrawing" xmlns:w10="urn:schemas-microsoft-com:office:word" xmlns:w="http://schemas.openxmlformats.org/wordprocessingml/2006/main" xmlns:w14="http://schemas.microsoft.com/office/word/2010/wordml" xmlns:w15="http://schemas.microsoft.com/office/word/2012/wordml" xmlns:w16cex="http://schemas.microsoft.com/office/word/2018/wordml/cex" xmlns:w16cid="http://schemas.microsoft.com/office/word/2016/wordml/cid" xmlns:w16="http://schemas.microsoft.com/office/word/2018/wordml" xmlns:w16du="http://schemas.microsoft.com/office/word/2023/wordml/word16du" xmlns:w16sdtdh="http://schemas.microsoft.com/office/word/2020/wordml/sdtdatahash" xmlns:w16sdtfl="http://schemas.microsoft.com/office/word/2024/wordml/sdtformatlock" xmlns:w16se="http://schemas.microsoft.com/office/word/2015/wordml/symex" xmlns:wpg="http://schemas.microsoft.com/office/word/2010/wordprocessingGroup" xmlns:wpi="http://schemas.microsoft.com/office/word/2010/wordprocessingInk" xmlns:wne="http://schemas.microsoft.com/office/word/2006/wordml" xmlns:wps="http://schemas.microsoft.com/office/word/2010/wordprocessingShape" mc:Ignorable="w14 w15 w16se w16cid w16 w16cex w16sdtdh w16sdtfl w16du wp14">
+  <w:p>
+    <w:pPr>
+      <w:pStyle w:val="Nagwek"/>
+      <w:rPr>
+        <w:rFonts w:hint="eastAsia"/>
+      </w:rPr>
+    </w:pPr>
+  </w:p>
+</w:hdr>
 </file>
 
 <file path=word/numbering.xml><?xml version="1.0" encoding="utf-8"?>
@@ -25747,6 +25895,28 @@
       </w:tblBorders>
     </w:tblPr>
   </w:style>
+  <w:style w:type="paragraph" w:styleId="Stopka">
+    <w:name w:val="footer"/>
+    <w:basedOn w:val="Normalny"/>
+    <w:link w:val="StopkaZnak"/>
+    <w:uiPriority w:val="99"/>
+    <w:unhideWhenUsed/>
+    <w:rsid w:val="00D97628"/>
+    <w:pPr>
+      <w:tabs>
+        <w:tab w:val="center" w:pos="4536"/>
+        <w:tab w:val="right" w:pos="9072"/>
+      </w:tabs>
+      <w:spacing w:after="0" w:line="240" w:lineRule="auto"/>
+    </w:pPr>
+  </w:style>
+  <w:style w:type="character" w:customStyle="1" w:styleId="StopkaZnak">
+    <w:name w:val="Stopka Znak"/>
+    <w:basedOn w:val="Domylnaczcionkaakapitu"/>
+    <w:link w:val="Stopka"/>
+    <w:uiPriority w:val="99"/>
+    <w:rsid w:val="00D97628"/>
+  </w:style>
 </w:styles>
 </file>
 

</xml_diff>